<commit_message>
Agregar el tablero de partes del interior a la hoja de ingreso
El tablero de marcado se parte en dos: PARTES DANADAS - EXTERIOR, con las
36 partes de carroceria de siempre, y PARTES DANADAS - INTERIOR, nuevo,
con 12 partes: tablero, timon, radio, asientos, tapiz de puertas, cielo
raso, alfombras, palanca, retrovisor, guantera y cinturones.

La hoja ya estaba llena al 100%, asi que el sitio sale de: la franja de
servicios (era el unico bloque decorativo), una linea de observaciones,
y los rellenos internos de los tableros. En el Word ademas se achican el
logo y los espacios del encabezado y del pie.

Ambas versiones siguen en una sola hoja A4 y conservan las medidas de la
hoja de referencia del taller.

Co-Authored-By: Claude Opus 5 <noreply@anthropic.com>
Claude-Session: https://claude.ai/code/session_01EAxoWDzBm6hR4XtGMHBt1M
</commit_message>
<xml_diff>
--- a/Hoja-Ingreso-Vehicular-ABARCA.docx
+++ b/Hoja-Ingreso-Vehicular-ABARCA.docx
@@ -45,7 +45,7 @@
             <w:r>
               <w:drawing>
                 <wp:inline distT="0" distB="0" distL="0" distR="0">
-                  <wp:extent cx="685800" cy="647700"/>
+                  <wp:extent cx="533400" cy="504825"/>
                   <wp:effectExtent t="0" r="0" b="0" l="0"/>
                   <wp:docPr id="1" name="" descr="" title=""/>
                   <wp:cNvGraphicFramePr>
@@ -70,7 +70,7 @@
                         <pic:spPr bwMode="auto">
                           <a:xfrm>
                             <a:off x="0" y="0"/>
-                            <a:ext cx="685800" cy="647700"/>
+                            <a:ext cx="533400" cy="504825"/>
                           </a:xfrm>
                           <a:prstGeom prst="rect">
                             <a:avLst/>
@@ -114,8 +114,8 @@
                 <w:b/>
                 <w:bCs/>
                 <w:color w:val="262626"/>
-                <w:sz w:val="46"/>
-                <w:szCs w:val="46"/>
+                <w:sz w:val="40"/>
+                <w:szCs w:val="40"/>
               </w:rPr>
               <w:t xml:space="preserve">ABARCA</w:t>
             </w:r>
@@ -190,7 +190,7 @@
                 </w:tcPr>
                 <w:p>
                   <w:pPr>
-                    <w:spacing w:after="60" w:before="60"/>
+                    <w:spacing w:after="40" w:before="40"/>
                     <w:jc w:val="center"/>
                   </w:pPr>
                   <w:r>
@@ -227,7 +227,7 @@
                 </w:tcPr>
                 <w:p>
                   <w:pPr>
-                    <w:spacing w:after="60" w:before="60"/>
+                    <w:spacing w:after="40" w:before="40"/>
                     <w:jc w:val="center"/>
                   </w:pPr>
                   <w:r>
@@ -251,7 +251,7 @@
     </w:tbl>
     <w:p>
       <w:pPr>
-        <w:spacing w:after="80" w:before="0"/>
+        <w:spacing w:after="20" w:before="0"/>
       </w:pPr>
       <w:r>
         <w:rPr>
@@ -343,93 +343,7 @@
     </w:p>
     <w:p>
       <w:pPr>
-        <w:spacing w:after="110" w:before="0"/>
-      </w:pPr>
-      <w:r>
-        <w:rPr>
-          <w:rFonts w:ascii="Calibri" w:cs="Calibri" w:eastAsia="Calibri" w:hAnsi="Calibri"/>
-          <w:b w:val="false"/>
-          <w:bCs w:val="false"/>
-          <w:color w:val="1B1917"/>
-          <w:sz w:val="2"/>
-          <w:szCs w:val="2"/>
-        </w:rPr>
-        <w:t xml:space="preserve"/>
-      </w:r>
-    </w:p>
-    <w:tbl>
-      <w:tblPr>
-        <w:tblW w:type="dxa" w:w="10454"/>
-        <w:tblBorders>
-          <w:top w:val="single" w:color="auto" w:sz="4"/>
-          <w:left w:val="single" w:color="auto" w:sz="4"/>
-          <w:bottom w:val="single" w:color="auto" w:sz="4"/>
-          <w:right w:val="single" w:color="auto" w:sz="4"/>
-          <w:insideH w:val="single" w:color="auto" w:sz="4"/>
-          <w:insideV w:val="single" w:color="auto" w:sz="4"/>
-        </w:tblBorders>
-      </w:tblPr>
-      <w:tblGrid>
-        <w:gridCol w:w="10454"/>
-      </w:tblGrid>
-      <w:tr>
-        <w:tc>
-          <w:tcPr>
-            <w:tcW w:type="dxa" w:w="10454"/>
-            <w:tcBorders>
-              <w:top w:val="single" w:color="D9D3CD" w:sz="4"/>
-              <w:left w:val="single" w:color="D9D3CD" w:sz="4"/>
-              <w:bottom w:val="single" w:color="D9D3CD" w:sz="4"/>
-              <w:right w:val="single" w:color="D9D3CD" w:sz="4"/>
-            </w:tcBorders>
-            <w:tcMar>
-              <w:top w:type="dxa" w:w="0"/>
-              <w:left w:type="dxa" w:w="110"/>
-              <w:bottom w:type="dxa" w:w="0"/>
-              <w:right w:type="dxa" w:w="110"/>
-            </w:tcMar>
-            <w:vAlign w:val="center"/>
-          </w:tcPr>
-          <w:p>
-            <w:pPr>
-              <w:spacing w:after="0" w:before="50"/>
-              <w:jc w:val="center"/>
-            </w:pPr>
-            <w:r>
-              <w:rPr>
-                <w:rFonts w:ascii="Calibri" w:cs="Calibri" w:eastAsia="Calibri" w:hAnsi="Calibri"/>
-                <w:b w:val="false"/>
-                <w:bCs w:val="false"/>
-                <w:color w:val="6E6660"/>
-                <w:sz w:val="20"/>
-                <w:szCs w:val="20"/>
-              </w:rPr>
-              <w:t xml:space="preserve">Reparación de carrocería  |  Reparación de fibra de vidrio  |  Reconstrucción</w:t>
-            </w:r>
-          </w:p>
-          <w:p>
-            <w:pPr>
-              <w:spacing w:after="50" w:before="0"/>
-              <w:jc w:val="center"/>
-            </w:pPr>
-            <w:r>
-              <w:rPr>
-                <w:rFonts w:ascii="Calibri" w:cs="Calibri" w:eastAsia="Calibri" w:hAnsi="Calibri"/>
-                <w:b w:val="false"/>
-                <w:bCs w:val="false"/>
-                <w:color w:val="6E6660"/>
-                <w:sz w:val="20"/>
-                <w:szCs w:val="20"/>
-              </w:rPr>
-              <w:t xml:space="preserve">Desabolladura  |  Reparación de rayones  |  Enderezado de chasis  |  Modificaciones, entre otros.</w:t>
-            </w:r>
-          </w:p>
-        </w:tc>
-      </w:tr>
-    </w:tbl>
-    <w:p>
-      <w:pPr>
-        <w:spacing w:after="150" w:before="0"/>
+        <w:spacing w:after="60" w:before="0"/>
       </w:pPr>
       <w:r>
         <w:rPr>
@@ -977,7 +891,7 @@
     </w:tbl>
     <w:p>
       <w:pPr>
-        <w:spacing w:after="150" w:before="0"/>
+        <w:spacing w:after="110" w:before="0"/>
       </w:pPr>
       <w:r>
         <w:rPr>
@@ -1512,7 +1426,7 @@
     </w:tbl>
     <w:p>
       <w:pPr>
-        <w:spacing w:after="150" w:before="0"/>
+        <w:spacing w:after="110" w:before="0"/>
       </w:pPr>
       <w:r>
         <w:rPr>
@@ -1577,7 +1491,7 @@
                 <w:sz w:val="22"/>
                 <w:szCs w:val="22"/>
               </w:rPr>
-              <w:t xml:space="preserve">PARTES DAÑADAS — MARCAR SÍ O NO</w:t>
+              <w:t xml:space="preserve">PARTES DAÑADAS — EXTERIOR</w:t>
             </w:r>
           </w:p>
         </w:tc>
@@ -1585,7 +1499,7 @@
     </w:tbl>
     <w:p>
       <w:pPr>
-        <w:spacing w:after="60" w:before="0"/>
+        <w:spacing w:after="50" w:before="0"/>
       </w:pPr>
       <w:r>
         <w:rPr>
@@ -1626,15 +1540,15 @@
             </w:tcBorders>
             <w:tcMar>
               <w:top w:type="dxa" w:w="0"/>
-              <w:left w:type="dxa" w:w="150"/>
+              <w:left w:type="dxa" w:w="130"/>
               <w:bottom w:type="dxa" w:w="0"/>
-              <w:right w:type="dxa" w:w="150"/>
+              <w:right w:type="dxa" w:w="130"/>
             </w:tcMar>
             <w:vAlign w:val="center"/>
           </w:tcPr>
           <w:p>
             <w:pPr>
-              <w:spacing w:after="90" w:before="0"/>
+              <w:spacing w:after="70" w:before="0"/>
             </w:pPr>
             <w:r>
               <w:rPr>
@@ -1701,8 +1615,8 @@
                       <w:b/>
                       <w:bCs/>
                       <w:color w:val="6E6660"/>
-                      <w:sz w:val="16"/>
-                      <w:szCs w:val="16"/>
+                      <w:sz w:val="15"/>
+                      <w:szCs w:val="15"/>
                     </w:rPr>
                     <w:t xml:space="preserve">PARTE</w:t>
                   </w:r>
@@ -1736,8 +1650,8 @@
                       <w:b/>
                       <w:bCs/>
                       <w:color w:val="6E6660"/>
-                      <w:sz w:val="16"/>
-                      <w:szCs w:val="16"/>
+                      <w:sz w:val="15"/>
+                      <w:szCs w:val="15"/>
                     </w:rPr>
                     <w:t xml:space="preserve">SÍ</w:t>
                   </w:r>
@@ -1771,8 +1685,8 @@
                       <w:b/>
                       <w:bCs/>
                       <w:color w:val="6E6660"/>
-                      <w:sz w:val="16"/>
-                      <w:szCs w:val="16"/>
+                      <w:sz w:val="15"/>
+                      <w:szCs w:val="15"/>
                     </w:rPr>
                     <w:t xml:space="preserve">NO</w:t>
                   </w:r>
@@ -1839,8 +1753,8 @@
                       <w:b/>
                       <w:bCs/>
                       <w:color w:val="6E6660"/>
-                      <w:sz w:val="16"/>
-                      <w:szCs w:val="16"/>
+                      <w:sz w:val="15"/>
+                      <w:szCs w:val="15"/>
                     </w:rPr>
                     <w:t xml:space="preserve">PARTE</w:t>
                   </w:r>
@@ -1874,8 +1788,8 @@
                       <w:b/>
                       <w:bCs/>
                       <w:color w:val="6E6660"/>
-                      <w:sz w:val="16"/>
-                      <w:szCs w:val="16"/>
+                      <w:sz w:val="15"/>
+                      <w:szCs w:val="15"/>
                     </w:rPr>
                     <w:t xml:space="preserve">SÍ</w:t>
                   </w:r>
@@ -1909,8 +1823,8 @@
                       <w:b/>
                       <w:bCs/>
                       <w:color w:val="6E6660"/>
-                      <w:sz w:val="16"/>
-                      <w:szCs w:val="16"/>
+                      <w:sz w:val="15"/>
+                      <w:szCs w:val="15"/>
                     </w:rPr>
                     <w:t xml:space="preserve">NO</w:t>
                   </w:r>
@@ -1977,8 +1891,8 @@
                       <w:b/>
                       <w:bCs/>
                       <w:color w:val="6E6660"/>
-                      <w:sz w:val="16"/>
-                      <w:szCs w:val="16"/>
+                      <w:sz w:val="15"/>
+                      <w:szCs w:val="15"/>
                     </w:rPr>
                     <w:t xml:space="preserve">PARTE</w:t>
                   </w:r>
@@ -2012,8 +1926,8 @@
                       <w:b/>
                       <w:bCs/>
                       <w:color w:val="6E6660"/>
-                      <w:sz w:val="16"/>
-                      <w:szCs w:val="16"/>
+                      <w:sz w:val="15"/>
+                      <w:szCs w:val="15"/>
                     </w:rPr>
                     <w:t xml:space="preserve">SÍ</w:t>
                   </w:r>
@@ -2047,8 +1961,8 @@
                       <w:b/>
                       <w:bCs/>
                       <w:color w:val="6E6660"/>
-                      <w:sz w:val="16"/>
-                      <w:szCs w:val="16"/>
+                      <w:sz w:val="15"/>
+                      <w:szCs w:val="15"/>
                     </w:rPr>
                     <w:t xml:space="preserve">NO</w:t>
                   </w:r>
@@ -2057,7 +1971,7 @@
             </w:tr>
             <w:tr>
               <w:trPr>
-                <w:trHeight w:val="250" w:hRule="atLeast"/>
+                <w:trHeight w:val="185" w:hRule="atLeast"/>
               </w:trPr>
               <w:tc>
                 <w:tcPr>
@@ -2086,8 +2000,8 @@
                       <w:b w:val="false"/>
                       <w:bCs w:val="false"/>
                       <w:color w:val="1B1917"/>
-                      <w:sz w:val="17"/>
-                      <w:szCs w:val="17"/>
+                      <w:sz w:val="15"/>
+                      <w:szCs w:val="15"/>
                     </w:rPr>
                     <w:t xml:space="preserve">Parachoques delantero</w:t>
                   </w:r>
@@ -2224,8 +2138,8 @@
                       <w:b w:val="false"/>
                       <w:bCs w:val="false"/>
                       <w:color w:val="1B1917"/>
-                      <w:sz w:val="17"/>
-                      <w:szCs w:val="17"/>
+                      <w:sz w:val="15"/>
+                      <w:szCs w:val="15"/>
                     </w:rPr>
                     <w:t xml:space="preserve">Puerta delantera izq.</w:t>
                   </w:r>
@@ -2362,8 +2276,8 @@
                       <w:b w:val="false"/>
                       <w:bCs w:val="false"/>
                       <w:color w:val="1B1917"/>
-                      <w:sz w:val="17"/>
-                      <w:szCs w:val="17"/>
+                      <w:sz w:val="15"/>
+                      <w:szCs w:val="15"/>
                     </w:rPr>
                     <w:t xml:space="preserve">Parachoques posterior</w:t>
                   </w:r>
@@ -2442,7 +2356,7 @@
             </w:tr>
             <w:tr>
               <w:trPr>
-                <w:trHeight w:val="250" w:hRule="atLeast"/>
+                <w:trHeight w:val="185" w:hRule="atLeast"/>
               </w:trPr>
               <w:tc>
                 <w:tcPr>
@@ -2471,8 +2385,8 @@
                       <w:b w:val="false"/>
                       <w:bCs w:val="false"/>
                       <w:color w:val="1B1917"/>
-                      <w:sz w:val="17"/>
-                      <w:szCs w:val="17"/>
+                      <w:sz w:val="15"/>
+                      <w:szCs w:val="15"/>
                     </w:rPr>
                     <w:t xml:space="preserve">Capó</w:t>
                   </w:r>
@@ -2609,8 +2523,8 @@
                       <w:b w:val="false"/>
                       <w:bCs w:val="false"/>
                       <w:color w:val="1B1917"/>
-                      <w:sz w:val="17"/>
-                      <w:szCs w:val="17"/>
+                      <w:sz w:val="15"/>
+                      <w:szCs w:val="15"/>
                     </w:rPr>
                     <w:t xml:space="preserve">Puerta posterior izq.</w:t>
                   </w:r>
@@ -2747,8 +2661,8 @@
                       <w:b w:val="false"/>
                       <w:bCs w:val="false"/>
                       <w:color w:val="1B1917"/>
-                      <w:sz w:val="17"/>
-                      <w:szCs w:val="17"/>
+                      <w:sz w:val="15"/>
+                      <w:szCs w:val="15"/>
                     </w:rPr>
                     <w:t xml:space="preserve">Maletera / tapa post.</w:t>
                   </w:r>
@@ -2827,7 +2741,7 @@
             </w:tr>
             <w:tr>
               <w:trPr>
-                <w:trHeight w:val="250" w:hRule="atLeast"/>
+                <w:trHeight w:val="185" w:hRule="atLeast"/>
               </w:trPr>
               <w:tc>
                 <w:tcPr>
@@ -2856,8 +2770,8 @@
                       <w:b w:val="false"/>
                       <w:bCs w:val="false"/>
                       <w:color w:val="1B1917"/>
-                      <w:sz w:val="17"/>
-                      <w:szCs w:val="17"/>
+                      <w:sz w:val="15"/>
+                      <w:szCs w:val="15"/>
                     </w:rPr>
                     <w:t xml:space="preserve">Parrilla</w:t>
                   </w:r>
@@ -2994,8 +2908,8 @@
                       <w:b w:val="false"/>
                       <w:bCs w:val="false"/>
                       <w:color w:val="1B1917"/>
-                      <w:sz w:val="17"/>
-                      <w:szCs w:val="17"/>
+                      <w:sz w:val="15"/>
+                      <w:szCs w:val="15"/>
                     </w:rPr>
                     <w:t xml:space="preserve">Panel lateral izq.</w:t>
                   </w:r>
@@ -3132,8 +3046,8 @@
                       <w:b w:val="false"/>
                       <w:bCs w:val="false"/>
                       <w:color w:val="1B1917"/>
-                      <w:sz w:val="17"/>
-                      <w:szCs w:val="17"/>
+                      <w:sz w:val="15"/>
+                      <w:szCs w:val="15"/>
                     </w:rPr>
                     <w:t xml:space="preserve">Panel posterior izq.</w:t>
                   </w:r>
@@ -3212,7 +3126,7 @@
             </w:tr>
             <w:tr>
               <w:trPr>
-                <w:trHeight w:val="250" w:hRule="atLeast"/>
+                <w:trHeight w:val="185" w:hRule="atLeast"/>
               </w:trPr>
               <w:tc>
                 <w:tcPr>
@@ -3241,8 +3155,8 @@
                       <w:b w:val="false"/>
                       <w:bCs w:val="false"/>
                       <w:color w:val="1B1917"/>
-                      <w:sz w:val="17"/>
-                      <w:szCs w:val="17"/>
+                      <w:sz w:val="15"/>
+                      <w:szCs w:val="15"/>
                     </w:rPr>
                     <w:t xml:space="preserve">Faro delantero izq.</w:t>
                   </w:r>
@@ -3379,8 +3293,8 @@
                       <w:b w:val="false"/>
                       <w:bCs w:val="false"/>
                       <w:color w:val="1B1917"/>
-                      <w:sz w:val="17"/>
-                      <w:szCs w:val="17"/>
+                      <w:sz w:val="15"/>
+                      <w:szCs w:val="15"/>
                     </w:rPr>
                     <w:t xml:space="preserve">Estribo izquierdo</w:t>
                   </w:r>
@@ -3517,8 +3431,8 @@
                       <w:b w:val="false"/>
                       <w:bCs w:val="false"/>
                       <w:color w:val="1B1917"/>
-                      <w:sz w:val="17"/>
-                      <w:szCs w:val="17"/>
+                      <w:sz w:val="15"/>
+                      <w:szCs w:val="15"/>
                     </w:rPr>
                     <w:t xml:space="preserve">Panel posterior der.</w:t>
                   </w:r>
@@ -3597,7 +3511,7 @@
             </w:tr>
             <w:tr>
               <w:trPr>
-                <w:trHeight w:val="250" w:hRule="atLeast"/>
+                <w:trHeight w:val="185" w:hRule="atLeast"/>
               </w:trPr>
               <w:tc>
                 <w:tcPr>
@@ -3626,8 +3540,8 @@
                       <w:b w:val="false"/>
                       <w:bCs w:val="false"/>
                       <w:color w:val="1B1917"/>
-                      <w:sz w:val="17"/>
-                      <w:szCs w:val="17"/>
+                      <w:sz w:val="15"/>
+                      <w:szCs w:val="15"/>
                     </w:rPr>
                     <w:t xml:space="preserve">Faro delantero der.</w:t>
                   </w:r>
@@ -3764,8 +3678,8 @@
                       <w:b w:val="false"/>
                       <w:bCs w:val="false"/>
                       <w:color w:val="1B1917"/>
-                      <w:sz w:val="17"/>
-                      <w:szCs w:val="17"/>
+                      <w:sz w:val="15"/>
+                      <w:szCs w:val="15"/>
                     </w:rPr>
                     <w:t xml:space="preserve">Espejo izquierdo</w:t>
                   </w:r>
@@ -3902,8 +3816,8 @@
                       <w:b w:val="false"/>
                       <w:bCs w:val="false"/>
                       <w:color w:val="1B1917"/>
-                      <w:sz w:val="17"/>
-                      <w:szCs w:val="17"/>
+                      <w:sz w:val="15"/>
+                      <w:szCs w:val="15"/>
                     </w:rPr>
                     <w:t xml:space="preserve">Guardafango post. izq.</w:t>
                   </w:r>
@@ -3982,7 +3896,7 @@
             </w:tr>
             <w:tr>
               <w:trPr>
-                <w:trHeight w:val="250" w:hRule="atLeast"/>
+                <w:trHeight w:val="185" w:hRule="atLeast"/>
               </w:trPr>
               <w:tc>
                 <w:tcPr>
@@ -4011,8 +3925,8 @@
                       <w:b w:val="false"/>
                       <w:bCs w:val="false"/>
                       <w:color w:val="1B1917"/>
-                      <w:sz w:val="17"/>
-                      <w:szCs w:val="17"/>
+                      <w:sz w:val="15"/>
+                      <w:szCs w:val="15"/>
                     </w:rPr>
                     <w:t xml:space="preserve">Parabrisas delantero</w:t>
                   </w:r>
@@ -4149,8 +4063,8 @@
                       <w:b w:val="false"/>
                       <w:bCs w:val="false"/>
                       <w:color w:val="1B1917"/>
-                      <w:sz w:val="17"/>
-                      <w:szCs w:val="17"/>
+                      <w:sz w:val="15"/>
+                      <w:szCs w:val="15"/>
                     </w:rPr>
                     <w:t xml:space="preserve">Baranda lateral izq.</w:t>
                   </w:r>
@@ -4287,8 +4201,8 @@
                       <w:b w:val="false"/>
                       <w:bCs w:val="false"/>
                       <w:color w:val="1B1917"/>
-                      <w:sz w:val="17"/>
-                      <w:szCs w:val="17"/>
+                      <w:sz w:val="15"/>
+                      <w:szCs w:val="15"/>
                     </w:rPr>
                     <w:t xml:space="preserve">Guardafango post. der.</w:t>
                   </w:r>
@@ -4367,7 +4281,7 @@
             </w:tr>
             <w:tr>
               <w:trPr>
-                <w:trHeight w:val="250" w:hRule="atLeast"/>
+                <w:trHeight w:val="185" w:hRule="atLeast"/>
               </w:trPr>
               <w:tc>
                 <w:tcPr>
@@ -4396,8 +4310,8 @@
                       <w:b w:val="false"/>
                       <w:bCs w:val="false"/>
                       <w:color w:val="1B1917"/>
-                      <w:sz w:val="17"/>
-                      <w:szCs w:val="17"/>
+                      <w:sz w:val="15"/>
+                      <w:szCs w:val="15"/>
                     </w:rPr>
                     <w:t xml:space="preserve">Guardafango del. izq.</w:t>
                   </w:r>
@@ -4534,8 +4448,8 @@
                       <w:b w:val="false"/>
                       <w:bCs w:val="false"/>
                       <w:color w:val="1B1917"/>
-                      <w:sz w:val="17"/>
-                      <w:szCs w:val="17"/>
+                      <w:sz w:val="15"/>
+                      <w:szCs w:val="15"/>
                     </w:rPr>
                     <w:t xml:space="preserve">Puerta delantera der.</w:t>
                   </w:r>
@@ -4672,8 +4586,8 @@
                       <w:b w:val="false"/>
                       <w:bCs w:val="false"/>
                       <w:color w:val="1B1917"/>
-                      <w:sz w:val="17"/>
-                      <w:szCs w:val="17"/>
+                      <w:sz w:val="15"/>
+                      <w:szCs w:val="15"/>
                     </w:rPr>
                     <w:t xml:space="preserve">Faro posterior izq.</w:t>
                   </w:r>
@@ -4752,7 +4666,7 @@
             </w:tr>
             <w:tr>
               <w:trPr>
-                <w:trHeight w:val="250" w:hRule="atLeast"/>
+                <w:trHeight w:val="185" w:hRule="atLeast"/>
               </w:trPr>
               <w:tc>
                 <w:tcPr>
@@ -4781,8 +4695,8 @@
                       <w:b w:val="false"/>
                       <w:bCs w:val="false"/>
                       <w:color w:val="1B1917"/>
-                      <w:sz w:val="17"/>
-                      <w:szCs w:val="17"/>
+                      <w:sz w:val="15"/>
+                      <w:szCs w:val="15"/>
                     </w:rPr>
                     <w:t xml:space="preserve">Guardafango del. der.</w:t>
                   </w:r>
@@ -4919,8 +4833,8 @@
                       <w:b w:val="false"/>
                       <w:bCs w:val="false"/>
                       <w:color w:val="1B1917"/>
-                      <w:sz w:val="17"/>
-                      <w:szCs w:val="17"/>
+                      <w:sz w:val="15"/>
+                      <w:szCs w:val="15"/>
                     </w:rPr>
                     <w:t xml:space="preserve">Puerta posterior der.</w:t>
                   </w:r>
@@ -5057,8 +4971,8 @@
                       <w:b w:val="false"/>
                       <w:bCs w:val="false"/>
                       <w:color w:val="1B1917"/>
-                      <w:sz w:val="17"/>
-                      <w:szCs w:val="17"/>
+                      <w:sz w:val="15"/>
+                      <w:szCs w:val="15"/>
                     </w:rPr>
                     <w:t xml:space="preserve">Faro posterior der.</w:t>
                   </w:r>
@@ -5137,7 +5051,7 @@
             </w:tr>
             <w:tr>
               <w:trPr>
-                <w:trHeight w:val="250" w:hRule="atLeast"/>
+                <w:trHeight w:val="185" w:hRule="atLeast"/>
               </w:trPr>
               <w:tc>
                 <w:tcPr>
@@ -5166,8 +5080,8 @@
                       <w:b w:val="false"/>
                       <w:bCs w:val="false"/>
                       <w:color w:val="1B1917"/>
-                      <w:sz w:val="17"/>
-                      <w:szCs w:val="17"/>
+                      <w:sz w:val="15"/>
+                      <w:szCs w:val="15"/>
                     </w:rPr>
                     <w:t xml:space="preserve">Techo</w:t>
                   </w:r>
@@ -5304,8 +5218,8 @@
                       <w:b w:val="false"/>
                       <w:bCs w:val="false"/>
                       <w:color w:val="1B1917"/>
-                      <w:sz w:val="17"/>
-                      <w:szCs w:val="17"/>
+                      <w:sz w:val="15"/>
+                      <w:szCs w:val="15"/>
                     </w:rPr>
                     <w:t xml:space="preserve">Panel lateral der.</w:t>
                   </w:r>
@@ -5442,8 +5356,8 @@
                       <w:b w:val="false"/>
                       <w:bCs w:val="false"/>
                       <w:color w:val="1B1917"/>
-                      <w:sz w:val="17"/>
-                      <w:szCs w:val="17"/>
+                      <w:sz w:val="15"/>
+                      <w:szCs w:val="15"/>
                     </w:rPr>
                     <w:t xml:space="preserve">Luna posterior</w:t>
                   </w:r>
@@ -5522,7 +5436,7 @@
             </w:tr>
             <w:tr>
               <w:trPr>
-                <w:trHeight w:val="250" w:hRule="atLeast"/>
+                <w:trHeight w:val="185" w:hRule="atLeast"/>
               </w:trPr>
               <w:tc>
                 <w:tcPr>
@@ -5551,8 +5465,8 @@
                       <w:b w:val="false"/>
                       <w:bCs w:val="false"/>
                       <w:color w:val="1B1917"/>
-                      <w:sz w:val="17"/>
-                      <w:szCs w:val="17"/>
+                      <w:sz w:val="15"/>
+                      <w:szCs w:val="15"/>
                     </w:rPr>
                     <w:t xml:space="preserve">Aros / llantas</w:t>
                   </w:r>
@@ -5689,8 +5603,8 @@
                       <w:b w:val="false"/>
                       <w:bCs w:val="false"/>
                       <w:color w:val="1B1917"/>
-                      <w:sz w:val="17"/>
-                      <w:szCs w:val="17"/>
+                      <w:sz w:val="15"/>
+                      <w:szCs w:val="15"/>
                     </w:rPr>
                     <w:t xml:space="preserve">Estribo derecho</w:t>
                   </w:r>
@@ -5827,8 +5741,8 @@
                       <w:b w:val="false"/>
                       <w:bCs w:val="false"/>
                       <w:color w:val="1B1917"/>
-                      <w:sz w:val="17"/>
-                      <w:szCs w:val="17"/>
+                      <w:sz w:val="15"/>
+                      <w:szCs w:val="15"/>
                     </w:rPr>
                     <w:t xml:space="preserve">Baranda posterior</w:t>
                   </w:r>
@@ -5907,7 +5821,7 @@
             </w:tr>
             <w:tr>
               <w:trPr>
-                <w:trHeight w:val="250" w:hRule="atLeast"/>
+                <w:trHeight w:val="185" w:hRule="atLeast"/>
               </w:trPr>
               <w:tc>
                 <w:tcPr>
@@ -5936,8 +5850,8 @@
                       <w:b w:val="false"/>
                       <w:bCs w:val="false"/>
                       <w:color w:val="1B1917"/>
-                      <w:sz w:val="17"/>
-                      <w:szCs w:val="17"/>
+                      <w:sz w:val="15"/>
+                      <w:szCs w:val="15"/>
                     </w:rPr>
                     <w:t xml:space="preserve">Chasis</w:t>
                   </w:r>
@@ -6074,8 +5988,8 @@
                       <w:b w:val="false"/>
                       <w:bCs w:val="false"/>
                       <w:color w:val="1B1917"/>
-                      <w:sz w:val="17"/>
-                      <w:szCs w:val="17"/>
+                      <w:sz w:val="15"/>
+                      <w:szCs w:val="15"/>
                     </w:rPr>
                     <w:t xml:space="preserve">Espejo derecho</w:t>
                   </w:r>
@@ -6212,8 +6126,8 @@
                       <w:b w:val="false"/>
                       <w:bCs w:val="false"/>
                       <w:color w:val="1B1917"/>
-                      <w:sz w:val="17"/>
-                      <w:szCs w:val="17"/>
+                      <w:sz w:val="15"/>
+                      <w:szCs w:val="15"/>
                     </w:rPr>
                     <w:t xml:space="preserve">Placa posterior</w:t>
                   </w:r>
@@ -6292,7 +6206,7 @@
             </w:tr>
             <w:tr>
               <w:trPr>
-                <w:trHeight w:val="250" w:hRule="atLeast"/>
+                <w:trHeight w:val="185" w:hRule="atLeast"/>
               </w:trPr>
               <w:tc>
                 <w:tcPr>
@@ -6321,8 +6235,8 @@
                       <w:b w:val="false"/>
                       <w:bCs w:val="false"/>
                       <w:color w:val="1B1917"/>
-                      <w:sz w:val="17"/>
-                      <w:szCs w:val="17"/>
+                      <w:sz w:val="15"/>
+                      <w:szCs w:val="15"/>
                     </w:rPr>
                     <w:t xml:space="preserve">Pintura general</w:t>
                   </w:r>
@@ -6459,8 +6373,8 @@
                       <w:b w:val="false"/>
                       <w:bCs w:val="false"/>
                       <w:color w:val="1B1917"/>
-                      <w:sz w:val="17"/>
-                      <w:szCs w:val="17"/>
+                      <w:sz w:val="15"/>
+                      <w:szCs w:val="15"/>
                     </w:rPr>
                     <w:t xml:space="preserve">Baranda lateral der.</w:t>
                   </w:r>
@@ -6597,8 +6511,8 @@
                       <w:b w:val="false"/>
                       <w:bCs w:val="false"/>
                       <w:color w:val="1B1917"/>
-                      <w:sz w:val="17"/>
-                      <w:szCs w:val="17"/>
+                      <w:sz w:val="15"/>
+                      <w:szCs w:val="15"/>
                     </w:rPr>
                     <w:t xml:space="preserve">Lunas laterales</w:t>
                   </w:r>
@@ -6682,7 +6596,2081 @@
     </w:tbl>
     <w:p>
       <w:pPr>
-        <w:spacing w:after="150" w:before="0"/>
+        <w:spacing w:after="80" w:before="0"/>
+      </w:pPr>
+      <w:r>
+        <w:rPr>
+          <w:rFonts w:ascii="Calibri" w:cs="Calibri" w:eastAsia="Calibri" w:hAnsi="Calibri"/>
+          <w:b w:val="false"/>
+          <w:bCs w:val="false"/>
+          <w:color w:val="1B1917"/>
+          <w:sz w:val="2"/>
+          <w:szCs w:val="2"/>
+        </w:rPr>
+        <w:t xml:space="preserve"/>
+      </w:r>
+    </w:p>
+    <w:tbl>
+      <w:tblPr>
+        <w:tblW w:type="dxa" w:w="10454"/>
+        <w:tblBorders>
+          <w:top w:val="single" w:color="auto" w:sz="4"/>
+          <w:left w:val="single" w:color="auto" w:sz="4"/>
+          <w:bottom w:val="single" w:color="auto" w:sz="4"/>
+          <w:right w:val="single" w:color="auto" w:sz="4"/>
+          <w:insideH w:val="single" w:color="auto" w:sz="4"/>
+          <w:insideV w:val="single" w:color="auto" w:sz="4"/>
+        </w:tblBorders>
+      </w:tblPr>
+      <w:tblGrid>
+        <w:gridCol w:w="10454"/>
+      </w:tblGrid>
+      <w:tr>
+        <w:trPr>
+          <w:trHeight w:val="284" w:hRule="exact"/>
+        </w:trPr>
+        <w:tc>
+          <w:tcPr>
+            <w:tcW w:type="dxa" w:w="10454"/>
+            <w:tcBorders>
+              <w:top w:val="none" w:color="FFFFFF" w:sz="0"/>
+              <w:left w:val="none" w:color="FFFFFF" w:sz="0"/>
+              <w:bottom w:val="none" w:color="FFFFFF" w:sz="0"/>
+              <w:right w:val="none" w:color="FFFFFF" w:sz="0"/>
+            </w:tcBorders>
+            <w:shd w:fill="000000" w:color="auto" w:val="clear"/>
+            <w:tcMar>
+              <w:top w:type="dxa" w:w="0"/>
+              <w:left w:type="dxa" w:w="110"/>
+              <w:bottom w:type="dxa" w:w="0"/>
+              <w:right w:type="dxa" w:w="110"/>
+            </w:tcMar>
+            <w:vAlign w:val="center"/>
+          </w:tcPr>
+          <w:p>
+            <w:pPr>
+              <w:spacing w:after="0" w:before="0"/>
+              <w:jc w:val="left"/>
+            </w:pPr>
+            <w:r>
+              <w:rPr>
+                <w:rFonts w:ascii="Calibri" w:cs="Calibri" w:eastAsia="Calibri" w:hAnsi="Calibri"/>
+                <w:b/>
+                <w:bCs/>
+                <w:color w:val="FFFFFF"/>
+                <w:sz w:val="22"/>
+                <w:szCs w:val="22"/>
+              </w:rPr>
+              <w:t xml:space="preserve">PARTES DAÑADAS — INTERIOR</w:t>
+            </w:r>
+          </w:p>
+        </w:tc>
+      </w:tr>
+    </w:tbl>
+    <w:p>
+      <w:pPr>
+        <w:spacing w:after="50" w:before="0"/>
+      </w:pPr>
+      <w:r>
+        <w:rPr>
+          <w:rFonts w:ascii="Calibri" w:cs="Calibri" w:eastAsia="Calibri" w:hAnsi="Calibri"/>
+          <w:b w:val="false"/>
+          <w:bCs w:val="false"/>
+          <w:color w:val="1B1917"/>
+          <w:sz w:val="2"/>
+          <w:szCs w:val="2"/>
+        </w:rPr>
+        <w:t xml:space="preserve"/>
+      </w:r>
+    </w:p>
+    <w:tbl>
+      <w:tblPr>
+        <w:tblW w:type="dxa" w:w="10454"/>
+        <w:tblBorders>
+          <w:top w:val="single" w:color="auto" w:sz="4"/>
+          <w:left w:val="single" w:color="auto" w:sz="4"/>
+          <w:bottom w:val="single" w:color="auto" w:sz="4"/>
+          <w:right w:val="single" w:color="auto" w:sz="4"/>
+          <w:insideH w:val="single" w:color="auto" w:sz="4"/>
+          <w:insideV w:val="single" w:color="auto" w:sz="4"/>
+        </w:tblBorders>
+      </w:tblPr>
+      <w:tblGrid>
+        <w:gridCol w:w="10454"/>
+      </w:tblGrid>
+      <w:tr>
+        <w:tc>
+          <w:tcPr>
+            <w:tcW w:type="dxa" w:w="10454"/>
+            <w:tcBorders>
+              <w:top w:val="single" w:color="D9D3CD" w:sz="4"/>
+              <w:left w:val="single" w:color="D9D3CD" w:sz="4"/>
+              <w:bottom w:val="single" w:color="D9D3CD" w:sz="4"/>
+              <w:right w:val="single" w:color="D9D3CD" w:sz="4"/>
+            </w:tcBorders>
+            <w:tcMar>
+              <w:top w:type="dxa" w:w="0"/>
+              <w:left w:type="dxa" w:w="130"/>
+              <w:bottom w:type="dxa" w:w="0"/>
+              <w:right w:type="dxa" w:w="130"/>
+            </w:tcMar>
+            <w:vAlign w:val="center"/>
+          </w:tcPr>
+          <w:tbl>
+            <w:tblPr>
+              <w:tblW w:type="dxa" w:w="10455"/>
+              <w:tblBorders>
+                <w:top w:val="single" w:color="auto" w:sz="4"/>
+                <w:left w:val="single" w:color="auto" w:sz="4"/>
+                <w:bottom w:val="single" w:color="auto" w:sz="4"/>
+                <w:right w:val="single" w:color="auto" w:sz="4"/>
+                <w:insideH w:val="single" w:color="auto" w:sz="4"/>
+                <w:insideV w:val="single" w:color="auto" w:sz="4"/>
+              </w:tblBorders>
+            </w:tblPr>
+            <w:tblGrid>
+              <w:gridCol w:w="2445"/>
+              <w:gridCol w:w="420"/>
+              <w:gridCol w:w="420"/>
+              <w:gridCol w:w="300"/>
+              <w:gridCol w:w="2445"/>
+              <w:gridCol w:w="420"/>
+              <w:gridCol w:w="420"/>
+              <w:gridCol w:w="300"/>
+              <w:gridCol w:w="2445"/>
+              <w:gridCol w:w="420"/>
+              <w:gridCol w:w="420"/>
+            </w:tblGrid>
+            <w:tr>
+              <w:tc>
+                <w:tcPr>
+                  <w:tcW w:type="dxa" w:w="2445"/>
+                  <w:tcBorders>
+                    <w:top w:val="none" w:color="FFFFFF" w:sz="0"/>
+                    <w:left w:val="none" w:color="FFFFFF" w:sz="0"/>
+                    <w:bottom w:val="single" w:color="D9D3CD" w:sz="4"/>
+                    <w:right w:val="none" w:color="FFFFFF" w:sz="0"/>
+                  </w:tcBorders>
+                  <w:tcMar>
+                    <w:top w:type="dxa" w:w="0"/>
+                    <w:left w:type="dxa" w:w="0"/>
+                    <w:bottom w:type="dxa" w:w="0"/>
+                    <w:right w:type="dxa" w:w="0"/>
+                  </w:tcMar>
+                  <w:vAlign w:val="center"/>
+                </w:tcPr>
+                <w:p>
+                  <w:pPr>
+                    <w:spacing w:after="0" w:before="0"/>
+                  </w:pPr>
+                  <w:r>
+                    <w:rPr>
+                      <w:rFonts w:ascii="Calibri" w:cs="Calibri" w:eastAsia="Calibri" w:hAnsi="Calibri"/>
+                      <w:b/>
+                      <w:bCs/>
+                      <w:color w:val="6E6660"/>
+                      <w:sz w:val="15"/>
+                      <w:szCs w:val="15"/>
+                    </w:rPr>
+                    <w:t xml:space="preserve">PARTE</w:t>
+                  </w:r>
+                </w:p>
+              </w:tc>
+              <w:tc>
+                <w:tcPr>
+                  <w:tcW w:type="dxa" w:w="420"/>
+                  <w:tcBorders>
+                    <w:top w:val="none" w:color="FFFFFF" w:sz="0"/>
+                    <w:left w:val="none" w:color="FFFFFF" w:sz="0"/>
+                    <w:bottom w:val="single" w:color="D9D3CD" w:sz="4"/>
+                    <w:right w:val="none" w:color="FFFFFF" w:sz="0"/>
+                  </w:tcBorders>
+                  <w:tcMar>
+                    <w:top w:type="dxa" w:w="0"/>
+                    <w:left w:type="dxa" w:w="0"/>
+                    <w:bottom w:type="dxa" w:w="0"/>
+                    <w:right w:type="dxa" w:w="0"/>
+                  </w:tcMar>
+                  <w:vAlign w:val="center"/>
+                </w:tcPr>
+                <w:p>
+                  <w:pPr>
+                    <w:spacing w:after="0" w:before="0"/>
+                    <w:jc w:val="center"/>
+                  </w:pPr>
+                  <w:r>
+                    <w:rPr>
+                      <w:rFonts w:ascii="Calibri" w:cs="Calibri" w:eastAsia="Calibri" w:hAnsi="Calibri"/>
+                      <w:b/>
+                      <w:bCs/>
+                      <w:color w:val="6E6660"/>
+                      <w:sz w:val="15"/>
+                      <w:szCs w:val="15"/>
+                    </w:rPr>
+                    <w:t xml:space="preserve">SÍ</w:t>
+                  </w:r>
+                </w:p>
+              </w:tc>
+              <w:tc>
+                <w:tcPr>
+                  <w:tcW w:type="dxa" w:w="420"/>
+                  <w:tcBorders>
+                    <w:top w:val="none" w:color="FFFFFF" w:sz="0"/>
+                    <w:left w:val="none" w:color="FFFFFF" w:sz="0"/>
+                    <w:bottom w:val="single" w:color="D9D3CD" w:sz="4"/>
+                    <w:right w:val="none" w:color="FFFFFF" w:sz="0"/>
+                  </w:tcBorders>
+                  <w:tcMar>
+                    <w:top w:type="dxa" w:w="0"/>
+                    <w:left w:type="dxa" w:w="0"/>
+                    <w:bottom w:type="dxa" w:w="0"/>
+                    <w:right w:type="dxa" w:w="0"/>
+                  </w:tcMar>
+                  <w:vAlign w:val="center"/>
+                </w:tcPr>
+                <w:p>
+                  <w:pPr>
+                    <w:spacing w:after="0" w:before="0"/>
+                    <w:jc w:val="center"/>
+                  </w:pPr>
+                  <w:r>
+                    <w:rPr>
+                      <w:rFonts w:ascii="Calibri" w:cs="Calibri" w:eastAsia="Calibri" w:hAnsi="Calibri"/>
+                      <w:b/>
+                      <w:bCs/>
+                      <w:color w:val="6E6660"/>
+                      <w:sz w:val="15"/>
+                      <w:szCs w:val="15"/>
+                    </w:rPr>
+                    <w:t xml:space="preserve">NO</w:t>
+                  </w:r>
+                </w:p>
+              </w:tc>
+              <w:tc>
+                <w:tcPr>
+                  <w:tcW w:type="dxa" w:w="300"/>
+                  <w:tcBorders>
+                    <w:top w:val="none" w:color="FFFFFF" w:sz="0"/>
+                    <w:left w:val="none" w:color="FFFFFF" w:sz="0"/>
+                    <w:bottom w:val="none" w:color="FFFFFF" w:sz="0"/>
+                    <w:right w:val="none" w:color="FFFFFF" w:sz="0"/>
+                  </w:tcBorders>
+                  <w:tcMar>
+                    <w:top w:type="dxa" w:w="0"/>
+                    <w:left w:type="dxa" w:w="0"/>
+                    <w:bottom w:type="dxa" w:w="0"/>
+                    <w:right w:type="dxa" w:w="0"/>
+                  </w:tcMar>
+                  <w:vAlign w:val="center"/>
+                </w:tcPr>
+                <w:p>
+                  <w:pPr>
+                    <w:spacing w:after="0" w:before="0"/>
+                  </w:pPr>
+                  <w:r>
+                    <w:rPr>
+                      <w:rFonts w:ascii="Calibri" w:cs="Calibri" w:eastAsia="Calibri" w:hAnsi="Calibri"/>
+                      <w:b w:val="false"/>
+                      <w:bCs w:val="false"/>
+                      <w:color w:val="1B1917"/>
+                      <w:sz w:val="24"/>
+                      <w:szCs w:val="24"/>
+                    </w:rPr>
+                    <w:t xml:space="preserve"/>
+                  </w:r>
+                </w:p>
+              </w:tc>
+              <w:tc>
+                <w:tcPr>
+                  <w:tcW w:type="dxa" w:w="2445"/>
+                  <w:tcBorders>
+                    <w:top w:val="none" w:color="FFFFFF" w:sz="0"/>
+                    <w:left w:val="none" w:color="FFFFFF" w:sz="0"/>
+                    <w:bottom w:val="single" w:color="D9D3CD" w:sz="4"/>
+                    <w:right w:val="none" w:color="FFFFFF" w:sz="0"/>
+                  </w:tcBorders>
+                  <w:tcMar>
+                    <w:top w:type="dxa" w:w="0"/>
+                    <w:left w:type="dxa" w:w="0"/>
+                    <w:bottom w:type="dxa" w:w="0"/>
+                    <w:right w:type="dxa" w:w="0"/>
+                  </w:tcMar>
+                  <w:vAlign w:val="center"/>
+                </w:tcPr>
+                <w:p>
+                  <w:pPr>
+                    <w:spacing w:after="0" w:before="0"/>
+                  </w:pPr>
+                  <w:r>
+                    <w:rPr>
+                      <w:rFonts w:ascii="Calibri" w:cs="Calibri" w:eastAsia="Calibri" w:hAnsi="Calibri"/>
+                      <w:b/>
+                      <w:bCs/>
+                      <w:color w:val="6E6660"/>
+                      <w:sz w:val="15"/>
+                      <w:szCs w:val="15"/>
+                    </w:rPr>
+                    <w:t xml:space="preserve">PARTE</w:t>
+                  </w:r>
+                </w:p>
+              </w:tc>
+              <w:tc>
+                <w:tcPr>
+                  <w:tcW w:type="dxa" w:w="420"/>
+                  <w:tcBorders>
+                    <w:top w:val="none" w:color="FFFFFF" w:sz="0"/>
+                    <w:left w:val="none" w:color="FFFFFF" w:sz="0"/>
+                    <w:bottom w:val="single" w:color="D9D3CD" w:sz="4"/>
+                    <w:right w:val="none" w:color="FFFFFF" w:sz="0"/>
+                  </w:tcBorders>
+                  <w:tcMar>
+                    <w:top w:type="dxa" w:w="0"/>
+                    <w:left w:type="dxa" w:w="0"/>
+                    <w:bottom w:type="dxa" w:w="0"/>
+                    <w:right w:type="dxa" w:w="0"/>
+                  </w:tcMar>
+                  <w:vAlign w:val="center"/>
+                </w:tcPr>
+                <w:p>
+                  <w:pPr>
+                    <w:spacing w:after="0" w:before="0"/>
+                    <w:jc w:val="center"/>
+                  </w:pPr>
+                  <w:r>
+                    <w:rPr>
+                      <w:rFonts w:ascii="Calibri" w:cs="Calibri" w:eastAsia="Calibri" w:hAnsi="Calibri"/>
+                      <w:b/>
+                      <w:bCs/>
+                      <w:color w:val="6E6660"/>
+                      <w:sz w:val="15"/>
+                      <w:szCs w:val="15"/>
+                    </w:rPr>
+                    <w:t xml:space="preserve">SÍ</w:t>
+                  </w:r>
+                </w:p>
+              </w:tc>
+              <w:tc>
+                <w:tcPr>
+                  <w:tcW w:type="dxa" w:w="420"/>
+                  <w:tcBorders>
+                    <w:top w:val="none" w:color="FFFFFF" w:sz="0"/>
+                    <w:left w:val="none" w:color="FFFFFF" w:sz="0"/>
+                    <w:bottom w:val="single" w:color="D9D3CD" w:sz="4"/>
+                    <w:right w:val="none" w:color="FFFFFF" w:sz="0"/>
+                  </w:tcBorders>
+                  <w:tcMar>
+                    <w:top w:type="dxa" w:w="0"/>
+                    <w:left w:type="dxa" w:w="0"/>
+                    <w:bottom w:type="dxa" w:w="0"/>
+                    <w:right w:type="dxa" w:w="0"/>
+                  </w:tcMar>
+                  <w:vAlign w:val="center"/>
+                </w:tcPr>
+                <w:p>
+                  <w:pPr>
+                    <w:spacing w:after="0" w:before="0"/>
+                    <w:jc w:val="center"/>
+                  </w:pPr>
+                  <w:r>
+                    <w:rPr>
+                      <w:rFonts w:ascii="Calibri" w:cs="Calibri" w:eastAsia="Calibri" w:hAnsi="Calibri"/>
+                      <w:b/>
+                      <w:bCs/>
+                      <w:color w:val="6E6660"/>
+                      <w:sz w:val="15"/>
+                      <w:szCs w:val="15"/>
+                    </w:rPr>
+                    <w:t xml:space="preserve">NO</w:t>
+                  </w:r>
+                </w:p>
+              </w:tc>
+              <w:tc>
+                <w:tcPr>
+                  <w:tcW w:type="dxa" w:w="300"/>
+                  <w:tcBorders>
+                    <w:top w:val="none" w:color="FFFFFF" w:sz="0"/>
+                    <w:left w:val="none" w:color="FFFFFF" w:sz="0"/>
+                    <w:bottom w:val="none" w:color="FFFFFF" w:sz="0"/>
+                    <w:right w:val="none" w:color="FFFFFF" w:sz="0"/>
+                  </w:tcBorders>
+                  <w:tcMar>
+                    <w:top w:type="dxa" w:w="0"/>
+                    <w:left w:type="dxa" w:w="0"/>
+                    <w:bottom w:type="dxa" w:w="0"/>
+                    <w:right w:type="dxa" w:w="0"/>
+                  </w:tcMar>
+                  <w:vAlign w:val="center"/>
+                </w:tcPr>
+                <w:p>
+                  <w:pPr>
+                    <w:spacing w:after="0" w:before="0"/>
+                  </w:pPr>
+                  <w:r>
+                    <w:rPr>
+                      <w:rFonts w:ascii="Calibri" w:cs="Calibri" w:eastAsia="Calibri" w:hAnsi="Calibri"/>
+                      <w:b w:val="false"/>
+                      <w:bCs w:val="false"/>
+                      <w:color w:val="1B1917"/>
+                      <w:sz w:val="24"/>
+                      <w:szCs w:val="24"/>
+                    </w:rPr>
+                    <w:t xml:space="preserve"/>
+                  </w:r>
+                </w:p>
+              </w:tc>
+              <w:tc>
+                <w:tcPr>
+                  <w:tcW w:type="dxa" w:w="2445"/>
+                  <w:tcBorders>
+                    <w:top w:val="none" w:color="FFFFFF" w:sz="0"/>
+                    <w:left w:val="none" w:color="FFFFFF" w:sz="0"/>
+                    <w:bottom w:val="single" w:color="D9D3CD" w:sz="4"/>
+                    <w:right w:val="none" w:color="FFFFFF" w:sz="0"/>
+                  </w:tcBorders>
+                  <w:tcMar>
+                    <w:top w:type="dxa" w:w="0"/>
+                    <w:left w:type="dxa" w:w="0"/>
+                    <w:bottom w:type="dxa" w:w="0"/>
+                    <w:right w:type="dxa" w:w="0"/>
+                  </w:tcMar>
+                  <w:vAlign w:val="center"/>
+                </w:tcPr>
+                <w:p>
+                  <w:pPr>
+                    <w:spacing w:after="0" w:before="0"/>
+                  </w:pPr>
+                  <w:r>
+                    <w:rPr>
+                      <w:rFonts w:ascii="Calibri" w:cs="Calibri" w:eastAsia="Calibri" w:hAnsi="Calibri"/>
+                      <w:b/>
+                      <w:bCs/>
+                      <w:color w:val="6E6660"/>
+                      <w:sz w:val="15"/>
+                      <w:szCs w:val="15"/>
+                    </w:rPr>
+                    <w:t xml:space="preserve">PARTE</w:t>
+                  </w:r>
+                </w:p>
+              </w:tc>
+              <w:tc>
+                <w:tcPr>
+                  <w:tcW w:type="dxa" w:w="420"/>
+                  <w:tcBorders>
+                    <w:top w:val="none" w:color="FFFFFF" w:sz="0"/>
+                    <w:left w:val="none" w:color="FFFFFF" w:sz="0"/>
+                    <w:bottom w:val="single" w:color="D9D3CD" w:sz="4"/>
+                    <w:right w:val="none" w:color="FFFFFF" w:sz="0"/>
+                  </w:tcBorders>
+                  <w:tcMar>
+                    <w:top w:type="dxa" w:w="0"/>
+                    <w:left w:type="dxa" w:w="0"/>
+                    <w:bottom w:type="dxa" w:w="0"/>
+                    <w:right w:type="dxa" w:w="0"/>
+                  </w:tcMar>
+                  <w:vAlign w:val="center"/>
+                </w:tcPr>
+                <w:p>
+                  <w:pPr>
+                    <w:spacing w:after="0" w:before="0"/>
+                    <w:jc w:val="center"/>
+                  </w:pPr>
+                  <w:r>
+                    <w:rPr>
+                      <w:rFonts w:ascii="Calibri" w:cs="Calibri" w:eastAsia="Calibri" w:hAnsi="Calibri"/>
+                      <w:b/>
+                      <w:bCs/>
+                      <w:color w:val="6E6660"/>
+                      <w:sz w:val="15"/>
+                      <w:szCs w:val="15"/>
+                    </w:rPr>
+                    <w:t xml:space="preserve">SÍ</w:t>
+                  </w:r>
+                </w:p>
+              </w:tc>
+              <w:tc>
+                <w:tcPr>
+                  <w:tcW w:type="dxa" w:w="420"/>
+                  <w:tcBorders>
+                    <w:top w:val="none" w:color="FFFFFF" w:sz="0"/>
+                    <w:left w:val="none" w:color="FFFFFF" w:sz="0"/>
+                    <w:bottom w:val="single" w:color="D9D3CD" w:sz="4"/>
+                    <w:right w:val="none" w:color="FFFFFF" w:sz="0"/>
+                  </w:tcBorders>
+                  <w:tcMar>
+                    <w:top w:type="dxa" w:w="0"/>
+                    <w:left w:type="dxa" w:w="0"/>
+                    <w:bottom w:type="dxa" w:w="0"/>
+                    <w:right w:type="dxa" w:w="0"/>
+                  </w:tcMar>
+                  <w:vAlign w:val="center"/>
+                </w:tcPr>
+                <w:p>
+                  <w:pPr>
+                    <w:spacing w:after="0" w:before="0"/>
+                    <w:jc w:val="center"/>
+                  </w:pPr>
+                  <w:r>
+                    <w:rPr>
+                      <w:rFonts w:ascii="Calibri" w:cs="Calibri" w:eastAsia="Calibri" w:hAnsi="Calibri"/>
+                      <w:b/>
+                      <w:bCs/>
+                      <w:color w:val="6E6660"/>
+                      <w:sz w:val="15"/>
+                      <w:szCs w:val="15"/>
+                    </w:rPr>
+                    <w:t xml:space="preserve">NO</w:t>
+                  </w:r>
+                </w:p>
+              </w:tc>
+            </w:tr>
+            <w:tr>
+              <w:trPr>
+                <w:trHeight w:val="185" w:hRule="atLeast"/>
+              </w:trPr>
+              <w:tc>
+                <w:tcPr>
+                  <w:tcW w:type="dxa" w:w="2445"/>
+                  <w:tcBorders>
+                    <w:top w:val="none" w:color="FFFFFF" w:sz="0"/>
+                    <w:left w:val="none" w:color="FFFFFF" w:sz="0"/>
+                    <w:bottom w:val="dotted" w:color="D9D3CD" w:sz="4"/>
+                    <w:right w:val="none" w:color="FFFFFF" w:sz="0"/>
+                  </w:tcBorders>
+                  <w:tcMar>
+                    <w:top w:type="dxa" w:w="0"/>
+                    <w:left w:type="dxa" w:w="0"/>
+                    <w:bottom w:type="dxa" w:w="0"/>
+                    <w:right w:type="dxa" w:w="0"/>
+                  </w:tcMar>
+                  <w:vAlign w:val="center"/>
+                </w:tcPr>
+                <w:p>
+                  <w:pPr>
+                    <w:spacing w:after="0" w:before="0"/>
+                  </w:pPr>
+                  <w:r>
+                    <w:rPr>
+                      <w:rFonts w:ascii="Calibri" w:cs="Calibri" w:eastAsia="Calibri" w:hAnsi="Calibri"/>
+                      <w:b w:val="false"/>
+                      <w:bCs w:val="false"/>
+                      <w:color w:val="1B1917"/>
+                      <w:sz w:val="15"/>
+                      <w:szCs w:val="15"/>
+                    </w:rPr>
+                    <w:t xml:space="preserve">Tablero / consola</w:t>
+                  </w:r>
+                </w:p>
+              </w:tc>
+              <w:tc>
+                <w:tcPr>
+                  <w:tcW w:type="dxa" w:w="420"/>
+                  <w:tcBorders>
+                    <w:top w:val="none" w:color="FFFFFF" w:sz="0"/>
+                    <w:left w:val="none" w:color="FFFFFF" w:sz="0"/>
+                    <w:bottom w:val="dotted" w:color="D9D3CD" w:sz="4"/>
+                    <w:right w:val="none" w:color="FFFFFF" w:sz="0"/>
+                  </w:tcBorders>
+                  <w:tcMar>
+                    <w:top w:type="dxa" w:w="0"/>
+                    <w:left w:type="dxa" w:w="0"/>
+                    <w:bottom w:type="dxa" w:w="0"/>
+                    <w:right w:type="dxa" w:w="0"/>
+                  </w:tcMar>
+                  <w:vAlign w:val="center"/>
+                </w:tcPr>
+                <w:p>
+                  <w:pPr>
+                    <w:spacing w:after="0" w:before="0"/>
+                    <w:jc w:val="center"/>
+                  </w:pPr>
+                  <w:r>
+                    <w:rPr>
+                      <w:rFonts w:ascii="Calibri" w:cs="Calibri" w:eastAsia="Calibri" w:hAnsi="Calibri"/>
+                      <w:b w:val="false"/>
+                      <w:bCs w:val="false"/>
+                      <w:color w:val="1B1917"/>
+                      <w:sz w:val="20"/>
+                      <w:szCs w:val="20"/>
+                    </w:rPr>
+                    <w:t xml:space="preserve">☐</w:t>
+                  </w:r>
+                </w:p>
+              </w:tc>
+              <w:tc>
+                <w:tcPr>
+                  <w:tcW w:type="dxa" w:w="420"/>
+                  <w:tcBorders>
+                    <w:top w:val="none" w:color="FFFFFF" w:sz="0"/>
+                    <w:left w:val="none" w:color="FFFFFF" w:sz="0"/>
+                    <w:bottom w:val="dotted" w:color="D9D3CD" w:sz="4"/>
+                    <w:right w:val="none" w:color="FFFFFF" w:sz="0"/>
+                  </w:tcBorders>
+                  <w:tcMar>
+                    <w:top w:type="dxa" w:w="0"/>
+                    <w:left w:type="dxa" w:w="0"/>
+                    <w:bottom w:type="dxa" w:w="0"/>
+                    <w:right w:type="dxa" w:w="0"/>
+                  </w:tcMar>
+                  <w:vAlign w:val="center"/>
+                </w:tcPr>
+                <w:p>
+                  <w:pPr>
+                    <w:spacing w:after="0" w:before="0"/>
+                    <w:jc w:val="center"/>
+                  </w:pPr>
+                  <w:r>
+                    <w:rPr>
+                      <w:rFonts w:ascii="Calibri" w:cs="Calibri" w:eastAsia="Calibri" w:hAnsi="Calibri"/>
+                      <w:b w:val="false"/>
+                      <w:bCs w:val="false"/>
+                      <w:color w:val="1B1917"/>
+                      <w:sz w:val="20"/>
+                      <w:szCs w:val="20"/>
+                    </w:rPr>
+                    <w:t xml:space="preserve">☐</w:t>
+                  </w:r>
+                </w:p>
+              </w:tc>
+              <w:tc>
+                <w:tcPr>
+                  <w:tcW w:type="dxa" w:w="300"/>
+                  <w:tcBorders>
+                    <w:top w:val="none" w:color="FFFFFF" w:sz="0"/>
+                    <w:left w:val="none" w:color="FFFFFF" w:sz="0"/>
+                    <w:bottom w:val="none" w:color="FFFFFF" w:sz="0"/>
+                    <w:right w:val="none" w:color="FFFFFF" w:sz="0"/>
+                  </w:tcBorders>
+                  <w:tcMar>
+                    <w:top w:type="dxa" w:w="0"/>
+                    <w:left w:type="dxa" w:w="0"/>
+                    <w:bottom w:type="dxa" w:w="0"/>
+                    <w:right w:type="dxa" w:w="0"/>
+                  </w:tcMar>
+                  <w:vAlign w:val="center"/>
+                </w:tcPr>
+                <w:p>
+                  <w:pPr>
+                    <w:spacing w:after="0" w:before="0"/>
+                  </w:pPr>
+                  <w:r>
+                    <w:rPr>
+                      <w:rFonts w:ascii="Calibri" w:cs="Calibri" w:eastAsia="Calibri" w:hAnsi="Calibri"/>
+                      <w:b w:val="false"/>
+                      <w:bCs w:val="false"/>
+                      <w:color w:val="1B1917"/>
+                      <w:sz w:val="24"/>
+                      <w:szCs w:val="24"/>
+                    </w:rPr>
+                    <w:t xml:space="preserve"/>
+                  </w:r>
+                </w:p>
+              </w:tc>
+              <w:tc>
+                <w:tcPr>
+                  <w:tcW w:type="dxa" w:w="2445"/>
+                  <w:tcBorders>
+                    <w:top w:val="none" w:color="FFFFFF" w:sz="0"/>
+                    <w:left w:val="none" w:color="FFFFFF" w:sz="0"/>
+                    <w:bottom w:val="dotted" w:color="D9D3CD" w:sz="4"/>
+                    <w:right w:val="none" w:color="FFFFFF" w:sz="0"/>
+                  </w:tcBorders>
+                  <w:tcMar>
+                    <w:top w:type="dxa" w:w="0"/>
+                    <w:left w:type="dxa" w:w="0"/>
+                    <w:bottom w:type="dxa" w:w="0"/>
+                    <w:right w:type="dxa" w:w="0"/>
+                  </w:tcMar>
+                  <w:vAlign w:val="center"/>
+                </w:tcPr>
+                <w:p>
+                  <w:pPr>
+                    <w:spacing w:after="0" w:before="0"/>
+                  </w:pPr>
+                  <w:r>
+                    <w:rPr>
+                      <w:rFonts w:ascii="Calibri" w:cs="Calibri" w:eastAsia="Calibri" w:hAnsi="Calibri"/>
+                      <w:b w:val="false"/>
+                      <w:bCs w:val="false"/>
+                      <w:color w:val="1B1917"/>
+                      <w:sz w:val="15"/>
+                      <w:szCs w:val="15"/>
+                    </w:rPr>
+                    <w:t xml:space="preserve">Asientos posteriores</w:t>
+                  </w:r>
+                </w:p>
+              </w:tc>
+              <w:tc>
+                <w:tcPr>
+                  <w:tcW w:type="dxa" w:w="420"/>
+                  <w:tcBorders>
+                    <w:top w:val="none" w:color="FFFFFF" w:sz="0"/>
+                    <w:left w:val="none" w:color="FFFFFF" w:sz="0"/>
+                    <w:bottom w:val="dotted" w:color="D9D3CD" w:sz="4"/>
+                    <w:right w:val="none" w:color="FFFFFF" w:sz="0"/>
+                  </w:tcBorders>
+                  <w:tcMar>
+                    <w:top w:type="dxa" w:w="0"/>
+                    <w:left w:type="dxa" w:w="0"/>
+                    <w:bottom w:type="dxa" w:w="0"/>
+                    <w:right w:type="dxa" w:w="0"/>
+                  </w:tcMar>
+                  <w:vAlign w:val="center"/>
+                </w:tcPr>
+                <w:p>
+                  <w:pPr>
+                    <w:spacing w:after="0" w:before="0"/>
+                    <w:jc w:val="center"/>
+                  </w:pPr>
+                  <w:r>
+                    <w:rPr>
+                      <w:rFonts w:ascii="Calibri" w:cs="Calibri" w:eastAsia="Calibri" w:hAnsi="Calibri"/>
+                      <w:b w:val="false"/>
+                      <w:bCs w:val="false"/>
+                      <w:color w:val="1B1917"/>
+                      <w:sz w:val="20"/>
+                      <w:szCs w:val="20"/>
+                    </w:rPr>
+                    <w:t xml:space="preserve">☐</w:t>
+                  </w:r>
+                </w:p>
+              </w:tc>
+              <w:tc>
+                <w:tcPr>
+                  <w:tcW w:type="dxa" w:w="420"/>
+                  <w:tcBorders>
+                    <w:top w:val="none" w:color="FFFFFF" w:sz="0"/>
+                    <w:left w:val="none" w:color="FFFFFF" w:sz="0"/>
+                    <w:bottom w:val="dotted" w:color="D9D3CD" w:sz="4"/>
+                    <w:right w:val="none" w:color="FFFFFF" w:sz="0"/>
+                  </w:tcBorders>
+                  <w:tcMar>
+                    <w:top w:type="dxa" w:w="0"/>
+                    <w:left w:type="dxa" w:w="0"/>
+                    <w:bottom w:type="dxa" w:w="0"/>
+                    <w:right w:type="dxa" w:w="0"/>
+                  </w:tcMar>
+                  <w:vAlign w:val="center"/>
+                </w:tcPr>
+                <w:p>
+                  <w:pPr>
+                    <w:spacing w:after="0" w:before="0"/>
+                    <w:jc w:val="center"/>
+                  </w:pPr>
+                  <w:r>
+                    <w:rPr>
+                      <w:rFonts w:ascii="Calibri" w:cs="Calibri" w:eastAsia="Calibri" w:hAnsi="Calibri"/>
+                      <w:b w:val="false"/>
+                      <w:bCs w:val="false"/>
+                      <w:color w:val="1B1917"/>
+                      <w:sz w:val="20"/>
+                      <w:szCs w:val="20"/>
+                    </w:rPr>
+                    <w:t xml:space="preserve">☐</w:t>
+                  </w:r>
+                </w:p>
+              </w:tc>
+              <w:tc>
+                <w:tcPr>
+                  <w:tcW w:type="dxa" w:w="300"/>
+                  <w:tcBorders>
+                    <w:top w:val="none" w:color="FFFFFF" w:sz="0"/>
+                    <w:left w:val="none" w:color="FFFFFF" w:sz="0"/>
+                    <w:bottom w:val="none" w:color="FFFFFF" w:sz="0"/>
+                    <w:right w:val="none" w:color="FFFFFF" w:sz="0"/>
+                  </w:tcBorders>
+                  <w:tcMar>
+                    <w:top w:type="dxa" w:w="0"/>
+                    <w:left w:type="dxa" w:w="0"/>
+                    <w:bottom w:type="dxa" w:w="0"/>
+                    <w:right w:type="dxa" w:w="0"/>
+                  </w:tcMar>
+                  <w:vAlign w:val="center"/>
+                </w:tcPr>
+                <w:p>
+                  <w:pPr>
+                    <w:spacing w:after="0" w:before="0"/>
+                  </w:pPr>
+                  <w:r>
+                    <w:rPr>
+                      <w:rFonts w:ascii="Calibri" w:cs="Calibri" w:eastAsia="Calibri" w:hAnsi="Calibri"/>
+                      <w:b w:val="false"/>
+                      <w:bCs w:val="false"/>
+                      <w:color w:val="1B1917"/>
+                      <w:sz w:val="24"/>
+                      <w:szCs w:val="24"/>
+                    </w:rPr>
+                    <w:t xml:space="preserve"/>
+                  </w:r>
+                </w:p>
+              </w:tc>
+              <w:tc>
+                <w:tcPr>
+                  <w:tcW w:type="dxa" w:w="2445"/>
+                  <w:tcBorders>
+                    <w:top w:val="none" w:color="FFFFFF" w:sz="0"/>
+                    <w:left w:val="none" w:color="FFFFFF" w:sz="0"/>
+                    <w:bottom w:val="dotted" w:color="D9D3CD" w:sz="4"/>
+                    <w:right w:val="none" w:color="FFFFFF" w:sz="0"/>
+                  </w:tcBorders>
+                  <w:tcMar>
+                    <w:top w:type="dxa" w:w="0"/>
+                    <w:left w:type="dxa" w:w="0"/>
+                    <w:bottom w:type="dxa" w:w="0"/>
+                    <w:right w:type="dxa" w:w="0"/>
+                  </w:tcMar>
+                  <w:vAlign w:val="center"/>
+                </w:tcPr>
+                <w:p>
+                  <w:pPr>
+                    <w:spacing w:after="0" w:before="0"/>
+                  </w:pPr>
+                  <w:r>
+                    <w:rPr>
+                      <w:rFonts w:ascii="Calibri" w:cs="Calibri" w:eastAsia="Calibri" w:hAnsi="Calibri"/>
+                      <w:b w:val="false"/>
+                      <w:bCs w:val="false"/>
+                      <w:color w:val="1B1917"/>
+                      <w:sz w:val="15"/>
+                      <w:szCs w:val="15"/>
+                    </w:rPr>
+                    <w:t xml:space="preserve">Palanca de cambios</w:t>
+                  </w:r>
+                </w:p>
+              </w:tc>
+              <w:tc>
+                <w:tcPr>
+                  <w:tcW w:type="dxa" w:w="420"/>
+                  <w:tcBorders>
+                    <w:top w:val="none" w:color="FFFFFF" w:sz="0"/>
+                    <w:left w:val="none" w:color="FFFFFF" w:sz="0"/>
+                    <w:bottom w:val="dotted" w:color="D9D3CD" w:sz="4"/>
+                    <w:right w:val="none" w:color="FFFFFF" w:sz="0"/>
+                  </w:tcBorders>
+                  <w:tcMar>
+                    <w:top w:type="dxa" w:w="0"/>
+                    <w:left w:type="dxa" w:w="0"/>
+                    <w:bottom w:type="dxa" w:w="0"/>
+                    <w:right w:type="dxa" w:w="0"/>
+                  </w:tcMar>
+                  <w:vAlign w:val="center"/>
+                </w:tcPr>
+                <w:p>
+                  <w:pPr>
+                    <w:spacing w:after="0" w:before="0"/>
+                    <w:jc w:val="center"/>
+                  </w:pPr>
+                  <w:r>
+                    <w:rPr>
+                      <w:rFonts w:ascii="Calibri" w:cs="Calibri" w:eastAsia="Calibri" w:hAnsi="Calibri"/>
+                      <w:b w:val="false"/>
+                      <w:bCs w:val="false"/>
+                      <w:color w:val="1B1917"/>
+                      <w:sz w:val="20"/>
+                      <w:szCs w:val="20"/>
+                    </w:rPr>
+                    <w:t xml:space="preserve">☐</w:t>
+                  </w:r>
+                </w:p>
+              </w:tc>
+              <w:tc>
+                <w:tcPr>
+                  <w:tcW w:type="dxa" w:w="420"/>
+                  <w:tcBorders>
+                    <w:top w:val="none" w:color="FFFFFF" w:sz="0"/>
+                    <w:left w:val="none" w:color="FFFFFF" w:sz="0"/>
+                    <w:bottom w:val="dotted" w:color="D9D3CD" w:sz="4"/>
+                    <w:right w:val="none" w:color="FFFFFF" w:sz="0"/>
+                  </w:tcBorders>
+                  <w:tcMar>
+                    <w:top w:type="dxa" w:w="0"/>
+                    <w:left w:type="dxa" w:w="0"/>
+                    <w:bottom w:type="dxa" w:w="0"/>
+                    <w:right w:type="dxa" w:w="0"/>
+                  </w:tcMar>
+                  <w:vAlign w:val="center"/>
+                </w:tcPr>
+                <w:p>
+                  <w:pPr>
+                    <w:spacing w:after="0" w:before="0"/>
+                    <w:jc w:val="center"/>
+                  </w:pPr>
+                  <w:r>
+                    <w:rPr>
+                      <w:rFonts w:ascii="Calibri" w:cs="Calibri" w:eastAsia="Calibri" w:hAnsi="Calibri"/>
+                      <w:b w:val="false"/>
+                      <w:bCs w:val="false"/>
+                      <w:color w:val="1B1917"/>
+                      <w:sz w:val="20"/>
+                      <w:szCs w:val="20"/>
+                    </w:rPr>
+                    <w:t xml:space="preserve">☐</w:t>
+                  </w:r>
+                </w:p>
+              </w:tc>
+            </w:tr>
+            <w:tr>
+              <w:trPr>
+                <w:trHeight w:val="185" w:hRule="atLeast"/>
+              </w:trPr>
+              <w:tc>
+                <w:tcPr>
+                  <w:tcW w:type="dxa" w:w="2445"/>
+                  <w:tcBorders>
+                    <w:top w:val="none" w:color="FFFFFF" w:sz="0"/>
+                    <w:left w:val="none" w:color="FFFFFF" w:sz="0"/>
+                    <w:bottom w:val="dotted" w:color="D9D3CD" w:sz="4"/>
+                    <w:right w:val="none" w:color="FFFFFF" w:sz="0"/>
+                  </w:tcBorders>
+                  <w:tcMar>
+                    <w:top w:type="dxa" w:w="0"/>
+                    <w:left w:type="dxa" w:w="0"/>
+                    <w:bottom w:type="dxa" w:w="0"/>
+                    <w:right w:type="dxa" w:w="0"/>
+                  </w:tcMar>
+                  <w:vAlign w:val="center"/>
+                </w:tcPr>
+                <w:p>
+                  <w:pPr>
+                    <w:spacing w:after="0" w:before="0"/>
+                  </w:pPr>
+                  <w:r>
+                    <w:rPr>
+                      <w:rFonts w:ascii="Calibri" w:cs="Calibri" w:eastAsia="Calibri" w:hAnsi="Calibri"/>
+                      <w:b w:val="false"/>
+                      <w:bCs w:val="false"/>
+                      <w:color w:val="1B1917"/>
+                      <w:sz w:val="15"/>
+                      <w:szCs w:val="15"/>
+                    </w:rPr>
+                    <w:t xml:space="preserve">Timón</w:t>
+                  </w:r>
+                </w:p>
+              </w:tc>
+              <w:tc>
+                <w:tcPr>
+                  <w:tcW w:type="dxa" w:w="420"/>
+                  <w:tcBorders>
+                    <w:top w:val="none" w:color="FFFFFF" w:sz="0"/>
+                    <w:left w:val="none" w:color="FFFFFF" w:sz="0"/>
+                    <w:bottom w:val="dotted" w:color="D9D3CD" w:sz="4"/>
+                    <w:right w:val="none" w:color="FFFFFF" w:sz="0"/>
+                  </w:tcBorders>
+                  <w:tcMar>
+                    <w:top w:type="dxa" w:w="0"/>
+                    <w:left w:type="dxa" w:w="0"/>
+                    <w:bottom w:type="dxa" w:w="0"/>
+                    <w:right w:type="dxa" w:w="0"/>
+                  </w:tcMar>
+                  <w:vAlign w:val="center"/>
+                </w:tcPr>
+                <w:p>
+                  <w:pPr>
+                    <w:spacing w:after="0" w:before="0"/>
+                    <w:jc w:val="center"/>
+                  </w:pPr>
+                  <w:r>
+                    <w:rPr>
+                      <w:rFonts w:ascii="Calibri" w:cs="Calibri" w:eastAsia="Calibri" w:hAnsi="Calibri"/>
+                      <w:b w:val="false"/>
+                      <w:bCs w:val="false"/>
+                      <w:color w:val="1B1917"/>
+                      <w:sz w:val="20"/>
+                      <w:szCs w:val="20"/>
+                    </w:rPr>
+                    <w:t xml:space="preserve">☐</w:t>
+                  </w:r>
+                </w:p>
+              </w:tc>
+              <w:tc>
+                <w:tcPr>
+                  <w:tcW w:type="dxa" w:w="420"/>
+                  <w:tcBorders>
+                    <w:top w:val="none" w:color="FFFFFF" w:sz="0"/>
+                    <w:left w:val="none" w:color="FFFFFF" w:sz="0"/>
+                    <w:bottom w:val="dotted" w:color="D9D3CD" w:sz="4"/>
+                    <w:right w:val="none" w:color="FFFFFF" w:sz="0"/>
+                  </w:tcBorders>
+                  <w:tcMar>
+                    <w:top w:type="dxa" w:w="0"/>
+                    <w:left w:type="dxa" w:w="0"/>
+                    <w:bottom w:type="dxa" w:w="0"/>
+                    <w:right w:type="dxa" w:w="0"/>
+                  </w:tcMar>
+                  <w:vAlign w:val="center"/>
+                </w:tcPr>
+                <w:p>
+                  <w:pPr>
+                    <w:spacing w:after="0" w:before="0"/>
+                    <w:jc w:val="center"/>
+                  </w:pPr>
+                  <w:r>
+                    <w:rPr>
+                      <w:rFonts w:ascii="Calibri" w:cs="Calibri" w:eastAsia="Calibri" w:hAnsi="Calibri"/>
+                      <w:b w:val="false"/>
+                      <w:bCs w:val="false"/>
+                      <w:color w:val="1B1917"/>
+                      <w:sz w:val="20"/>
+                      <w:szCs w:val="20"/>
+                    </w:rPr>
+                    <w:t xml:space="preserve">☐</w:t>
+                  </w:r>
+                </w:p>
+              </w:tc>
+              <w:tc>
+                <w:tcPr>
+                  <w:tcW w:type="dxa" w:w="300"/>
+                  <w:tcBorders>
+                    <w:top w:val="none" w:color="FFFFFF" w:sz="0"/>
+                    <w:left w:val="none" w:color="FFFFFF" w:sz="0"/>
+                    <w:bottom w:val="none" w:color="FFFFFF" w:sz="0"/>
+                    <w:right w:val="none" w:color="FFFFFF" w:sz="0"/>
+                  </w:tcBorders>
+                  <w:tcMar>
+                    <w:top w:type="dxa" w:w="0"/>
+                    <w:left w:type="dxa" w:w="0"/>
+                    <w:bottom w:type="dxa" w:w="0"/>
+                    <w:right w:type="dxa" w:w="0"/>
+                  </w:tcMar>
+                  <w:vAlign w:val="center"/>
+                </w:tcPr>
+                <w:p>
+                  <w:pPr>
+                    <w:spacing w:after="0" w:before="0"/>
+                  </w:pPr>
+                  <w:r>
+                    <w:rPr>
+                      <w:rFonts w:ascii="Calibri" w:cs="Calibri" w:eastAsia="Calibri" w:hAnsi="Calibri"/>
+                      <w:b w:val="false"/>
+                      <w:bCs w:val="false"/>
+                      <w:color w:val="1B1917"/>
+                      <w:sz w:val="24"/>
+                      <w:szCs w:val="24"/>
+                    </w:rPr>
+                    <w:t xml:space="preserve"/>
+                  </w:r>
+                </w:p>
+              </w:tc>
+              <w:tc>
+                <w:tcPr>
+                  <w:tcW w:type="dxa" w:w="2445"/>
+                  <w:tcBorders>
+                    <w:top w:val="none" w:color="FFFFFF" w:sz="0"/>
+                    <w:left w:val="none" w:color="FFFFFF" w:sz="0"/>
+                    <w:bottom w:val="dotted" w:color="D9D3CD" w:sz="4"/>
+                    <w:right w:val="none" w:color="FFFFFF" w:sz="0"/>
+                  </w:tcBorders>
+                  <w:tcMar>
+                    <w:top w:type="dxa" w:w="0"/>
+                    <w:left w:type="dxa" w:w="0"/>
+                    <w:bottom w:type="dxa" w:w="0"/>
+                    <w:right w:type="dxa" w:w="0"/>
+                  </w:tcMar>
+                  <w:vAlign w:val="center"/>
+                </w:tcPr>
+                <w:p>
+                  <w:pPr>
+                    <w:spacing w:after="0" w:before="0"/>
+                  </w:pPr>
+                  <w:r>
+                    <w:rPr>
+                      <w:rFonts w:ascii="Calibri" w:cs="Calibri" w:eastAsia="Calibri" w:hAnsi="Calibri"/>
+                      <w:b w:val="false"/>
+                      <w:bCs w:val="false"/>
+                      <w:color w:val="1B1917"/>
+                      <w:sz w:val="15"/>
+                      <w:szCs w:val="15"/>
+                    </w:rPr>
+                    <w:t xml:space="preserve">Tapiz de puertas</w:t>
+                  </w:r>
+                </w:p>
+              </w:tc>
+              <w:tc>
+                <w:tcPr>
+                  <w:tcW w:type="dxa" w:w="420"/>
+                  <w:tcBorders>
+                    <w:top w:val="none" w:color="FFFFFF" w:sz="0"/>
+                    <w:left w:val="none" w:color="FFFFFF" w:sz="0"/>
+                    <w:bottom w:val="dotted" w:color="D9D3CD" w:sz="4"/>
+                    <w:right w:val="none" w:color="FFFFFF" w:sz="0"/>
+                  </w:tcBorders>
+                  <w:tcMar>
+                    <w:top w:type="dxa" w:w="0"/>
+                    <w:left w:type="dxa" w:w="0"/>
+                    <w:bottom w:type="dxa" w:w="0"/>
+                    <w:right w:type="dxa" w:w="0"/>
+                  </w:tcMar>
+                  <w:vAlign w:val="center"/>
+                </w:tcPr>
+                <w:p>
+                  <w:pPr>
+                    <w:spacing w:after="0" w:before="0"/>
+                    <w:jc w:val="center"/>
+                  </w:pPr>
+                  <w:r>
+                    <w:rPr>
+                      <w:rFonts w:ascii="Calibri" w:cs="Calibri" w:eastAsia="Calibri" w:hAnsi="Calibri"/>
+                      <w:b w:val="false"/>
+                      <w:bCs w:val="false"/>
+                      <w:color w:val="1B1917"/>
+                      <w:sz w:val="20"/>
+                      <w:szCs w:val="20"/>
+                    </w:rPr>
+                    <w:t xml:space="preserve">☐</w:t>
+                  </w:r>
+                </w:p>
+              </w:tc>
+              <w:tc>
+                <w:tcPr>
+                  <w:tcW w:type="dxa" w:w="420"/>
+                  <w:tcBorders>
+                    <w:top w:val="none" w:color="FFFFFF" w:sz="0"/>
+                    <w:left w:val="none" w:color="FFFFFF" w:sz="0"/>
+                    <w:bottom w:val="dotted" w:color="D9D3CD" w:sz="4"/>
+                    <w:right w:val="none" w:color="FFFFFF" w:sz="0"/>
+                  </w:tcBorders>
+                  <w:tcMar>
+                    <w:top w:type="dxa" w:w="0"/>
+                    <w:left w:type="dxa" w:w="0"/>
+                    <w:bottom w:type="dxa" w:w="0"/>
+                    <w:right w:type="dxa" w:w="0"/>
+                  </w:tcMar>
+                  <w:vAlign w:val="center"/>
+                </w:tcPr>
+                <w:p>
+                  <w:pPr>
+                    <w:spacing w:after="0" w:before="0"/>
+                    <w:jc w:val="center"/>
+                  </w:pPr>
+                  <w:r>
+                    <w:rPr>
+                      <w:rFonts w:ascii="Calibri" w:cs="Calibri" w:eastAsia="Calibri" w:hAnsi="Calibri"/>
+                      <w:b w:val="false"/>
+                      <w:bCs w:val="false"/>
+                      <w:color w:val="1B1917"/>
+                      <w:sz w:val="20"/>
+                      <w:szCs w:val="20"/>
+                    </w:rPr>
+                    <w:t xml:space="preserve">☐</w:t>
+                  </w:r>
+                </w:p>
+              </w:tc>
+              <w:tc>
+                <w:tcPr>
+                  <w:tcW w:type="dxa" w:w="300"/>
+                  <w:tcBorders>
+                    <w:top w:val="none" w:color="FFFFFF" w:sz="0"/>
+                    <w:left w:val="none" w:color="FFFFFF" w:sz="0"/>
+                    <w:bottom w:val="none" w:color="FFFFFF" w:sz="0"/>
+                    <w:right w:val="none" w:color="FFFFFF" w:sz="0"/>
+                  </w:tcBorders>
+                  <w:tcMar>
+                    <w:top w:type="dxa" w:w="0"/>
+                    <w:left w:type="dxa" w:w="0"/>
+                    <w:bottom w:type="dxa" w:w="0"/>
+                    <w:right w:type="dxa" w:w="0"/>
+                  </w:tcMar>
+                  <w:vAlign w:val="center"/>
+                </w:tcPr>
+                <w:p>
+                  <w:pPr>
+                    <w:spacing w:after="0" w:before="0"/>
+                  </w:pPr>
+                  <w:r>
+                    <w:rPr>
+                      <w:rFonts w:ascii="Calibri" w:cs="Calibri" w:eastAsia="Calibri" w:hAnsi="Calibri"/>
+                      <w:b w:val="false"/>
+                      <w:bCs w:val="false"/>
+                      <w:color w:val="1B1917"/>
+                      <w:sz w:val="24"/>
+                      <w:szCs w:val="24"/>
+                    </w:rPr>
+                    <w:t xml:space="preserve"/>
+                  </w:r>
+                </w:p>
+              </w:tc>
+              <w:tc>
+                <w:tcPr>
+                  <w:tcW w:type="dxa" w:w="2445"/>
+                  <w:tcBorders>
+                    <w:top w:val="none" w:color="FFFFFF" w:sz="0"/>
+                    <w:left w:val="none" w:color="FFFFFF" w:sz="0"/>
+                    <w:bottom w:val="dotted" w:color="D9D3CD" w:sz="4"/>
+                    <w:right w:val="none" w:color="FFFFFF" w:sz="0"/>
+                  </w:tcBorders>
+                  <w:tcMar>
+                    <w:top w:type="dxa" w:w="0"/>
+                    <w:left w:type="dxa" w:w="0"/>
+                    <w:bottom w:type="dxa" w:w="0"/>
+                    <w:right w:type="dxa" w:w="0"/>
+                  </w:tcMar>
+                  <w:vAlign w:val="center"/>
+                </w:tcPr>
+                <w:p>
+                  <w:pPr>
+                    <w:spacing w:after="0" w:before="0"/>
+                  </w:pPr>
+                  <w:r>
+                    <w:rPr>
+                      <w:rFonts w:ascii="Calibri" w:cs="Calibri" w:eastAsia="Calibri" w:hAnsi="Calibri"/>
+                      <w:b w:val="false"/>
+                      <w:bCs w:val="false"/>
+                      <w:color w:val="1B1917"/>
+                      <w:sz w:val="15"/>
+                      <w:szCs w:val="15"/>
+                    </w:rPr>
+                    <w:t xml:space="preserve">Espejo retrovisor</w:t>
+                  </w:r>
+                </w:p>
+              </w:tc>
+              <w:tc>
+                <w:tcPr>
+                  <w:tcW w:type="dxa" w:w="420"/>
+                  <w:tcBorders>
+                    <w:top w:val="none" w:color="FFFFFF" w:sz="0"/>
+                    <w:left w:val="none" w:color="FFFFFF" w:sz="0"/>
+                    <w:bottom w:val="dotted" w:color="D9D3CD" w:sz="4"/>
+                    <w:right w:val="none" w:color="FFFFFF" w:sz="0"/>
+                  </w:tcBorders>
+                  <w:tcMar>
+                    <w:top w:type="dxa" w:w="0"/>
+                    <w:left w:type="dxa" w:w="0"/>
+                    <w:bottom w:type="dxa" w:w="0"/>
+                    <w:right w:type="dxa" w:w="0"/>
+                  </w:tcMar>
+                  <w:vAlign w:val="center"/>
+                </w:tcPr>
+                <w:p>
+                  <w:pPr>
+                    <w:spacing w:after="0" w:before="0"/>
+                    <w:jc w:val="center"/>
+                  </w:pPr>
+                  <w:r>
+                    <w:rPr>
+                      <w:rFonts w:ascii="Calibri" w:cs="Calibri" w:eastAsia="Calibri" w:hAnsi="Calibri"/>
+                      <w:b w:val="false"/>
+                      <w:bCs w:val="false"/>
+                      <w:color w:val="1B1917"/>
+                      <w:sz w:val="20"/>
+                      <w:szCs w:val="20"/>
+                    </w:rPr>
+                    <w:t xml:space="preserve">☐</w:t>
+                  </w:r>
+                </w:p>
+              </w:tc>
+              <w:tc>
+                <w:tcPr>
+                  <w:tcW w:type="dxa" w:w="420"/>
+                  <w:tcBorders>
+                    <w:top w:val="none" w:color="FFFFFF" w:sz="0"/>
+                    <w:left w:val="none" w:color="FFFFFF" w:sz="0"/>
+                    <w:bottom w:val="dotted" w:color="D9D3CD" w:sz="4"/>
+                    <w:right w:val="none" w:color="FFFFFF" w:sz="0"/>
+                  </w:tcBorders>
+                  <w:tcMar>
+                    <w:top w:type="dxa" w:w="0"/>
+                    <w:left w:type="dxa" w:w="0"/>
+                    <w:bottom w:type="dxa" w:w="0"/>
+                    <w:right w:type="dxa" w:w="0"/>
+                  </w:tcMar>
+                  <w:vAlign w:val="center"/>
+                </w:tcPr>
+                <w:p>
+                  <w:pPr>
+                    <w:spacing w:after="0" w:before="0"/>
+                    <w:jc w:val="center"/>
+                  </w:pPr>
+                  <w:r>
+                    <w:rPr>
+                      <w:rFonts w:ascii="Calibri" w:cs="Calibri" w:eastAsia="Calibri" w:hAnsi="Calibri"/>
+                      <w:b w:val="false"/>
+                      <w:bCs w:val="false"/>
+                      <w:color w:val="1B1917"/>
+                      <w:sz w:val="20"/>
+                      <w:szCs w:val="20"/>
+                    </w:rPr>
+                    <w:t xml:space="preserve">☐</w:t>
+                  </w:r>
+                </w:p>
+              </w:tc>
+            </w:tr>
+            <w:tr>
+              <w:trPr>
+                <w:trHeight w:val="185" w:hRule="atLeast"/>
+              </w:trPr>
+              <w:tc>
+                <w:tcPr>
+                  <w:tcW w:type="dxa" w:w="2445"/>
+                  <w:tcBorders>
+                    <w:top w:val="none" w:color="FFFFFF" w:sz="0"/>
+                    <w:left w:val="none" w:color="FFFFFF" w:sz="0"/>
+                    <w:bottom w:val="dotted" w:color="D9D3CD" w:sz="4"/>
+                    <w:right w:val="none" w:color="FFFFFF" w:sz="0"/>
+                  </w:tcBorders>
+                  <w:tcMar>
+                    <w:top w:type="dxa" w:w="0"/>
+                    <w:left w:type="dxa" w:w="0"/>
+                    <w:bottom w:type="dxa" w:w="0"/>
+                    <w:right w:type="dxa" w:w="0"/>
+                  </w:tcMar>
+                  <w:vAlign w:val="center"/>
+                </w:tcPr>
+                <w:p>
+                  <w:pPr>
+                    <w:spacing w:after="0" w:before="0"/>
+                  </w:pPr>
+                  <w:r>
+                    <w:rPr>
+                      <w:rFonts w:ascii="Calibri" w:cs="Calibri" w:eastAsia="Calibri" w:hAnsi="Calibri"/>
+                      <w:b w:val="false"/>
+                      <w:bCs w:val="false"/>
+                      <w:color w:val="1B1917"/>
+                      <w:sz w:val="15"/>
+                      <w:szCs w:val="15"/>
+                    </w:rPr>
+                    <w:t xml:space="preserve">Radio / autoestéreo</w:t>
+                  </w:r>
+                </w:p>
+              </w:tc>
+              <w:tc>
+                <w:tcPr>
+                  <w:tcW w:type="dxa" w:w="420"/>
+                  <w:tcBorders>
+                    <w:top w:val="none" w:color="FFFFFF" w:sz="0"/>
+                    <w:left w:val="none" w:color="FFFFFF" w:sz="0"/>
+                    <w:bottom w:val="dotted" w:color="D9D3CD" w:sz="4"/>
+                    <w:right w:val="none" w:color="FFFFFF" w:sz="0"/>
+                  </w:tcBorders>
+                  <w:tcMar>
+                    <w:top w:type="dxa" w:w="0"/>
+                    <w:left w:type="dxa" w:w="0"/>
+                    <w:bottom w:type="dxa" w:w="0"/>
+                    <w:right w:type="dxa" w:w="0"/>
+                  </w:tcMar>
+                  <w:vAlign w:val="center"/>
+                </w:tcPr>
+                <w:p>
+                  <w:pPr>
+                    <w:spacing w:after="0" w:before="0"/>
+                    <w:jc w:val="center"/>
+                  </w:pPr>
+                  <w:r>
+                    <w:rPr>
+                      <w:rFonts w:ascii="Calibri" w:cs="Calibri" w:eastAsia="Calibri" w:hAnsi="Calibri"/>
+                      <w:b w:val="false"/>
+                      <w:bCs w:val="false"/>
+                      <w:color w:val="1B1917"/>
+                      <w:sz w:val="20"/>
+                      <w:szCs w:val="20"/>
+                    </w:rPr>
+                    <w:t xml:space="preserve">☐</w:t>
+                  </w:r>
+                </w:p>
+              </w:tc>
+              <w:tc>
+                <w:tcPr>
+                  <w:tcW w:type="dxa" w:w="420"/>
+                  <w:tcBorders>
+                    <w:top w:val="none" w:color="FFFFFF" w:sz="0"/>
+                    <w:left w:val="none" w:color="FFFFFF" w:sz="0"/>
+                    <w:bottom w:val="dotted" w:color="D9D3CD" w:sz="4"/>
+                    <w:right w:val="none" w:color="FFFFFF" w:sz="0"/>
+                  </w:tcBorders>
+                  <w:tcMar>
+                    <w:top w:type="dxa" w:w="0"/>
+                    <w:left w:type="dxa" w:w="0"/>
+                    <w:bottom w:type="dxa" w:w="0"/>
+                    <w:right w:type="dxa" w:w="0"/>
+                  </w:tcMar>
+                  <w:vAlign w:val="center"/>
+                </w:tcPr>
+                <w:p>
+                  <w:pPr>
+                    <w:spacing w:after="0" w:before="0"/>
+                    <w:jc w:val="center"/>
+                  </w:pPr>
+                  <w:r>
+                    <w:rPr>
+                      <w:rFonts w:ascii="Calibri" w:cs="Calibri" w:eastAsia="Calibri" w:hAnsi="Calibri"/>
+                      <w:b w:val="false"/>
+                      <w:bCs w:val="false"/>
+                      <w:color w:val="1B1917"/>
+                      <w:sz w:val="20"/>
+                      <w:szCs w:val="20"/>
+                    </w:rPr>
+                    <w:t xml:space="preserve">☐</w:t>
+                  </w:r>
+                </w:p>
+              </w:tc>
+              <w:tc>
+                <w:tcPr>
+                  <w:tcW w:type="dxa" w:w="300"/>
+                  <w:tcBorders>
+                    <w:top w:val="none" w:color="FFFFFF" w:sz="0"/>
+                    <w:left w:val="none" w:color="FFFFFF" w:sz="0"/>
+                    <w:bottom w:val="none" w:color="FFFFFF" w:sz="0"/>
+                    <w:right w:val="none" w:color="FFFFFF" w:sz="0"/>
+                  </w:tcBorders>
+                  <w:tcMar>
+                    <w:top w:type="dxa" w:w="0"/>
+                    <w:left w:type="dxa" w:w="0"/>
+                    <w:bottom w:type="dxa" w:w="0"/>
+                    <w:right w:type="dxa" w:w="0"/>
+                  </w:tcMar>
+                  <w:vAlign w:val="center"/>
+                </w:tcPr>
+                <w:p>
+                  <w:pPr>
+                    <w:spacing w:after="0" w:before="0"/>
+                  </w:pPr>
+                  <w:r>
+                    <w:rPr>
+                      <w:rFonts w:ascii="Calibri" w:cs="Calibri" w:eastAsia="Calibri" w:hAnsi="Calibri"/>
+                      <w:b w:val="false"/>
+                      <w:bCs w:val="false"/>
+                      <w:color w:val="1B1917"/>
+                      <w:sz w:val="24"/>
+                      <w:szCs w:val="24"/>
+                    </w:rPr>
+                    <w:t xml:space="preserve"/>
+                  </w:r>
+                </w:p>
+              </w:tc>
+              <w:tc>
+                <w:tcPr>
+                  <w:tcW w:type="dxa" w:w="2445"/>
+                  <w:tcBorders>
+                    <w:top w:val="none" w:color="FFFFFF" w:sz="0"/>
+                    <w:left w:val="none" w:color="FFFFFF" w:sz="0"/>
+                    <w:bottom w:val="dotted" w:color="D9D3CD" w:sz="4"/>
+                    <w:right w:val="none" w:color="FFFFFF" w:sz="0"/>
+                  </w:tcBorders>
+                  <w:tcMar>
+                    <w:top w:type="dxa" w:w="0"/>
+                    <w:left w:type="dxa" w:w="0"/>
+                    <w:bottom w:type="dxa" w:w="0"/>
+                    <w:right w:type="dxa" w:w="0"/>
+                  </w:tcMar>
+                  <w:vAlign w:val="center"/>
+                </w:tcPr>
+                <w:p>
+                  <w:pPr>
+                    <w:spacing w:after="0" w:before="0"/>
+                  </w:pPr>
+                  <w:r>
+                    <w:rPr>
+                      <w:rFonts w:ascii="Calibri" w:cs="Calibri" w:eastAsia="Calibri" w:hAnsi="Calibri"/>
+                      <w:b w:val="false"/>
+                      <w:bCs w:val="false"/>
+                      <w:color w:val="1B1917"/>
+                      <w:sz w:val="15"/>
+                      <w:szCs w:val="15"/>
+                    </w:rPr>
+                    <w:t xml:space="preserve">Cielo raso (techo int.)</w:t>
+                  </w:r>
+                </w:p>
+              </w:tc>
+              <w:tc>
+                <w:tcPr>
+                  <w:tcW w:type="dxa" w:w="420"/>
+                  <w:tcBorders>
+                    <w:top w:val="none" w:color="FFFFFF" w:sz="0"/>
+                    <w:left w:val="none" w:color="FFFFFF" w:sz="0"/>
+                    <w:bottom w:val="dotted" w:color="D9D3CD" w:sz="4"/>
+                    <w:right w:val="none" w:color="FFFFFF" w:sz="0"/>
+                  </w:tcBorders>
+                  <w:tcMar>
+                    <w:top w:type="dxa" w:w="0"/>
+                    <w:left w:type="dxa" w:w="0"/>
+                    <w:bottom w:type="dxa" w:w="0"/>
+                    <w:right w:type="dxa" w:w="0"/>
+                  </w:tcMar>
+                  <w:vAlign w:val="center"/>
+                </w:tcPr>
+                <w:p>
+                  <w:pPr>
+                    <w:spacing w:after="0" w:before="0"/>
+                    <w:jc w:val="center"/>
+                  </w:pPr>
+                  <w:r>
+                    <w:rPr>
+                      <w:rFonts w:ascii="Calibri" w:cs="Calibri" w:eastAsia="Calibri" w:hAnsi="Calibri"/>
+                      <w:b w:val="false"/>
+                      <w:bCs w:val="false"/>
+                      <w:color w:val="1B1917"/>
+                      <w:sz w:val="20"/>
+                      <w:szCs w:val="20"/>
+                    </w:rPr>
+                    <w:t xml:space="preserve">☐</w:t>
+                  </w:r>
+                </w:p>
+              </w:tc>
+              <w:tc>
+                <w:tcPr>
+                  <w:tcW w:type="dxa" w:w="420"/>
+                  <w:tcBorders>
+                    <w:top w:val="none" w:color="FFFFFF" w:sz="0"/>
+                    <w:left w:val="none" w:color="FFFFFF" w:sz="0"/>
+                    <w:bottom w:val="dotted" w:color="D9D3CD" w:sz="4"/>
+                    <w:right w:val="none" w:color="FFFFFF" w:sz="0"/>
+                  </w:tcBorders>
+                  <w:tcMar>
+                    <w:top w:type="dxa" w:w="0"/>
+                    <w:left w:type="dxa" w:w="0"/>
+                    <w:bottom w:type="dxa" w:w="0"/>
+                    <w:right w:type="dxa" w:w="0"/>
+                  </w:tcMar>
+                  <w:vAlign w:val="center"/>
+                </w:tcPr>
+                <w:p>
+                  <w:pPr>
+                    <w:spacing w:after="0" w:before="0"/>
+                    <w:jc w:val="center"/>
+                  </w:pPr>
+                  <w:r>
+                    <w:rPr>
+                      <w:rFonts w:ascii="Calibri" w:cs="Calibri" w:eastAsia="Calibri" w:hAnsi="Calibri"/>
+                      <w:b w:val="false"/>
+                      <w:bCs w:val="false"/>
+                      <w:color w:val="1B1917"/>
+                      <w:sz w:val="20"/>
+                      <w:szCs w:val="20"/>
+                    </w:rPr>
+                    <w:t xml:space="preserve">☐</w:t>
+                  </w:r>
+                </w:p>
+              </w:tc>
+              <w:tc>
+                <w:tcPr>
+                  <w:tcW w:type="dxa" w:w="300"/>
+                  <w:tcBorders>
+                    <w:top w:val="none" w:color="FFFFFF" w:sz="0"/>
+                    <w:left w:val="none" w:color="FFFFFF" w:sz="0"/>
+                    <w:bottom w:val="none" w:color="FFFFFF" w:sz="0"/>
+                    <w:right w:val="none" w:color="FFFFFF" w:sz="0"/>
+                  </w:tcBorders>
+                  <w:tcMar>
+                    <w:top w:type="dxa" w:w="0"/>
+                    <w:left w:type="dxa" w:w="0"/>
+                    <w:bottom w:type="dxa" w:w="0"/>
+                    <w:right w:type="dxa" w:w="0"/>
+                  </w:tcMar>
+                  <w:vAlign w:val="center"/>
+                </w:tcPr>
+                <w:p>
+                  <w:pPr>
+                    <w:spacing w:after="0" w:before="0"/>
+                  </w:pPr>
+                  <w:r>
+                    <w:rPr>
+                      <w:rFonts w:ascii="Calibri" w:cs="Calibri" w:eastAsia="Calibri" w:hAnsi="Calibri"/>
+                      <w:b w:val="false"/>
+                      <w:bCs w:val="false"/>
+                      <w:color w:val="1B1917"/>
+                      <w:sz w:val="24"/>
+                      <w:szCs w:val="24"/>
+                    </w:rPr>
+                    <w:t xml:space="preserve"/>
+                  </w:r>
+                </w:p>
+              </w:tc>
+              <w:tc>
+                <w:tcPr>
+                  <w:tcW w:type="dxa" w:w="2445"/>
+                  <w:tcBorders>
+                    <w:top w:val="none" w:color="FFFFFF" w:sz="0"/>
+                    <w:left w:val="none" w:color="FFFFFF" w:sz="0"/>
+                    <w:bottom w:val="dotted" w:color="D9D3CD" w:sz="4"/>
+                    <w:right w:val="none" w:color="FFFFFF" w:sz="0"/>
+                  </w:tcBorders>
+                  <w:tcMar>
+                    <w:top w:type="dxa" w:w="0"/>
+                    <w:left w:type="dxa" w:w="0"/>
+                    <w:bottom w:type="dxa" w:w="0"/>
+                    <w:right w:type="dxa" w:w="0"/>
+                  </w:tcMar>
+                  <w:vAlign w:val="center"/>
+                </w:tcPr>
+                <w:p>
+                  <w:pPr>
+                    <w:spacing w:after="0" w:before="0"/>
+                  </w:pPr>
+                  <w:r>
+                    <w:rPr>
+                      <w:rFonts w:ascii="Calibri" w:cs="Calibri" w:eastAsia="Calibri" w:hAnsi="Calibri"/>
+                      <w:b w:val="false"/>
+                      <w:bCs w:val="false"/>
+                      <w:color w:val="1B1917"/>
+                      <w:sz w:val="15"/>
+                      <w:szCs w:val="15"/>
+                    </w:rPr>
+                    <w:t xml:space="preserve">Guantera</w:t>
+                  </w:r>
+                </w:p>
+              </w:tc>
+              <w:tc>
+                <w:tcPr>
+                  <w:tcW w:type="dxa" w:w="420"/>
+                  <w:tcBorders>
+                    <w:top w:val="none" w:color="FFFFFF" w:sz="0"/>
+                    <w:left w:val="none" w:color="FFFFFF" w:sz="0"/>
+                    <w:bottom w:val="dotted" w:color="D9D3CD" w:sz="4"/>
+                    <w:right w:val="none" w:color="FFFFFF" w:sz="0"/>
+                  </w:tcBorders>
+                  <w:tcMar>
+                    <w:top w:type="dxa" w:w="0"/>
+                    <w:left w:type="dxa" w:w="0"/>
+                    <w:bottom w:type="dxa" w:w="0"/>
+                    <w:right w:type="dxa" w:w="0"/>
+                  </w:tcMar>
+                  <w:vAlign w:val="center"/>
+                </w:tcPr>
+                <w:p>
+                  <w:pPr>
+                    <w:spacing w:after="0" w:before="0"/>
+                    <w:jc w:val="center"/>
+                  </w:pPr>
+                  <w:r>
+                    <w:rPr>
+                      <w:rFonts w:ascii="Calibri" w:cs="Calibri" w:eastAsia="Calibri" w:hAnsi="Calibri"/>
+                      <w:b w:val="false"/>
+                      <w:bCs w:val="false"/>
+                      <w:color w:val="1B1917"/>
+                      <w:sz w:val="20"/>
+                      <w:szCs w:val="20"/>
+                    </w:rPr>
+                    <w:t xml:space="preserve">☐</w:t>
+                  </w:r>
+                </w:p>
+              </w:tc>
+              <w:tc>
+                <w:tcPr>
+                  <w:tcW w:type="dxa" w:w="420"/>
+                  <w:tcBorders>
+                    <w:top w:val="none" w:color="FFFFFF" w:sz="0"/>
+                    <w:left w:val="none" w:color="FFFFFF" w:sz="0"/>
+                    <w:bottom w:val="dotted" w:color="D9D3CD" w:sz="4"/>
+                    <w:right w:val="none" w:color="FFFFFF" w:sz="0"/>
+                  </w:tcBorders>
+                  <w:tcMar>
+                    <w:top w:type="dxa" w:w="0"/>
+                    <w:left w:type="dxa" w:w="0"/>
+                    <w:bottom w:type="dxa" w:w="0"/>
+                    <w:right w:type="dxa" w:w="0"/>
+                  </w:tcMar>
+                  <w:vAlign w:val="center"/>
+                </w:tcPr>
+                <w:p>
+                  <w:pPr>
+                    <w:spacing w:after="0" w:before="0"/>
+                    <w:jc w:val="center"/>
+                  </w:pPr>
+                  <w:r>
+                    <w:rPr>
+                      <w:rFonts w:ascii="Calibri" w:cs="Calibri" w:eastAsia="Calibri" w:hAnsi="Calibri"/>
+                      <w:b w:val="false"/>
+                      <w:bCs w:val="false"/>
+                      <w:color w:val="1B1917"/>
+                      <w:sz w:val="20"/>
+                      <w:szCs w:val="20"/>
+                    </w:rPr>
+                    <w:t xml:space="preserve">☐</w:t>
+                  </w:r>
+                </w:p>
+              </w:tc>
+            </w:tr>
+            <w:tr>
+              <w:trPr>
+                <w:trHeight w:val="185" w:hRule="atLeast"/>
+              </w:trPr>
+              <w:tc>
+                <w:tcPr>
+                  <w:tcW w:type="dxa" w:w="2445"/>
+                  <w:tcBorders>
+                    <w:top w:val="none" w:color="FFFFFF" w:sz="0"/>
+                    <w:left w:val="none" w:color="FFFFFF" w:sz="0"/>
+                    <w:bottom w:val="dotted" w:color="D9D3CD" w:sz="4"/>
+                    <w:right w:val="none" w:color="FFFFFF" w:sz="0"/>
+                  </w:tcBorders>
+                  <w:tcMar>
+                    <w:top w:type="dxa" w:w="0"/>
+                    <w:left w:type="dxa" w:w="0"/>
+                    <w:bottom w:type="dxa" w:w="0"/>
+                    <w:right w:type="dxa" w:w="0"/>
+                  </w:tcMar>
+                  <w:vAlign w:val="center"/>
+                </w:tcPr>
+                <w:p>
+                  <w:pPr>
+                    <w:spacing w:after="0" w:before="0"/>
+                  </w:pPr>
+                  <w:r>
+                    <w:rPr>
+                      <w:rFonts w:ascii="Calibri" w:cs="Calibri" w:eastAsia="Calibri" w:hAnsi="Calibri"/>
+                      <w:b w:val="false"/>
+                      <w:bCs w:val="false"/>
+                      <w:color w:val="1B1917"/>
+                      <w:sz w:val="15"/>
+                      <w:szCs w:val="15"/>
+                    </w:rPr>
+                    <w:t xml:space="preserve">Asientos delanteros</w:t>
+                  </w:r>
+                </w:p>
+              </w:tc>
+              <w:tc>
+                <w:tcPr>
+                  <w:tcW w:type="dxa" w:w="420"/>
+                  <w:tcBorders>
+                    <w:top w:val="none" w:color="FFFFFF" w:sz="0"/>
+                    <w:left w:val="none" w:color="FFFFFF" w:sz="0"/>
+                    <w:bottom w:val="dotted" w:color="D9D3CD" w:sz="4"/>
+                    <w:right w:val="none" w:color="FFFFFF" w:sz="0"/>
+                  </w:tcBorders>
+                  <w:tcMar>
+                    <w:top w:type="dxa" w:w="0"/>
+                    <w:left w:type="dxa" w:w="0"/>
+                    <w:bottom w:type="dxa" w:w="0"/>
+                    <w:right w:type="dxa" w:w="0"/>
+                  </w:tcMar>
+                  <w:vAlign w:val="center"/>
+                </w:tcPr>
+                <w:p>
+                  <w:pPr>
+                    <w:spacing w:after="0" w:before="0"/>
+                    <w:jc w:val="center"/>
+                  </w:pPr>
+                  <w:r>
+                    <w:rPr>
+                      <w:rFonts w:ascii="Calibri" w:cs="Calibri" w:eastAsia="Calibri" w:hAnsi="Calibri"/>
+                      <w:b w:val="false"/>
+                      <w:bCs w:val="false"/>
+                      <w:color w:val="1B1917"/>
+                      <w:sz w:val="20"/>
+                      <w:szCs w:val="20"/>
+                    </w:rPr>
+                    <w:t xml:space="preserve">☐</w:t>
+                  </w:r>
+                </w:p>
+              </w:tc>
+              <w:tc>
+                <w:tcPr>
+                  <w:tcW w:type="dxa" w:w="420"/>
+                  <w:tcBorders>
+                    <w:top w:val="none" w:color="FFFFFF" w:sz="0"/>
+                    <w:left w:val="none" w:color="FFFFFF" w:sz="0"/>
+                    <w:bottom w:val="dotted" w:color="D9D3CD" w:sz="4"/>
+                    <w:right w:val="none" w:color="FFFFFF" w:sz="0"/>
+                  </w:tcBorders>
+                  <w:tcMar>
+                    <w:top w:type="dxa" w:w="0"/>
+                    <w:left w:type="dxa" w:w="0"/>
+                    <w:bottom w:type="dxa" w:w="0"/>
+                    <w:right w:type="dxa" w:w="0"/>
+                  </w:tcMar>
+                  <w:vAlign w:val="center"/>
+                </w:tcPr>
+                <w:p>
+                  <w:pPr>
+                    <w:spacing w:after="0" w:before="0"/>
+                    <w:jc w:val="center"/>
+                  </w:pPr>
+                  <w:r>
+                    <w:rPr>
+                      <w:rFonts w:ascii="Calibri" w:cs="Calibri" w:eastAsia="Calibri" w:hAnsi="Calibri"/>
+                      <w:b w:val="false"/>
+                      <w:bCs w:val="false"/>
+                      <w:color w:val="1B1917"/>
+                      <w:sz w:val="20"/>
+                      <w:szCs w:val="20"/>
+                    </w:rPr>
+                    <w:t xml:space="preserve">☐</w:t>
+                  </w:r>
+                </w:p>
+              </w:tc>
+              <w:tc>
+                <w:tcPr>
+                  <w:tcW w:type="dxa" w:w="300"/>
+                  <w:tcBorders>
+                    <w:top w:val="none" w:color="FFFFFF" w:sz="0"/>
+                    <w:left w:val="none" w:color="FFFFFF" w:sz="0"/>
+                    <w:bottom w:val="none" w:color="FFFFFF" w:sz="0"/>
+                    <w:right w:val="none" w:color="FFFFFF" w:sz="0"/>
+                  </w:tcBorders>
+                  <w:tcMar>
+                    <w:top w:type="dxa" w:w="0"/>
+                    <w:left w:type="dxa" w:w="0"/>
+                    <w:bottom w:type="dxa" w:w="0"/>
+                    <w:right w:type="dxa" w:w="0"/>
+                  </w:tcMar>
+                  <w:vAlign w:val="center"/>
+                </w:tcPr>
+                <w:p>
+                  <w:pPr>
+                    <w:spacing w:after="0" w:before="0"/>
+                  </w:pPr>
+                  <w:r>
+                    <w:rPr>
+                      <w:rFonts w:ascii="Calibri" w:cs="Calibri" w:eastAsia="Calibri" w:hAnsi="Calibri"/>
+                      <w:b w:val="false"/>
+                      <w:bCs w:val="false"/>
+                      <w:color w:val="1B1917"/>
+                      <w:sz w:val="24"/>
+                      <w:szCs w:val="24"/>
+                    </w:rPr>
+                    <w:t xml:space="preserve"/>
+                  </w:r>
+                </w:p>
+              </w:tc>
+              <w:tc>
+                <w:tcPr>
+                  <w:tcW w:type="dxa" w:w="2445"/>
+                  <w:tcBorders>
+                    <w:top w:val="none" w:color="FFFFFF" w:sz="0"/>
+                    <w:left w:val="none" w:color="FFFFFF" w:sz="0"/>
+                    <w:bottom w:val="dotted" w:color="D9D3CD" w:sz="4"/>
+                    <w:right w:val="none" w:color="FFFFFF" w:sz="0"/>
+                  </w:tcBorders>
+                  <w:tcMar>
+                    <w:top w:type="dxa" w:w="0"/>
+                    <w:left w:type="dxa" w:w="0"/>
+                    <w:bottom w:type="dxa" w:w="0"/>
+                    <w:right w:type="dxa" w:w="0"/>
+                  </w:tcMar>
+                  <w:vAlign w:val="center"/>
+                </w:tcPr>
+                <w:p>
+                  <w:pPr>
+                    <w:spacing w:after="0" w:before="0"/>
+                  </w:pPr>
+                  <w:r>
+                    <w:rPr>
+                      <w:rFonts w:ascii="Calibri" w:cs="Calibri" w:eastAsia="Calibri" w:hAnsi="Calibri"/>
+                      <w:b w:val="false"/>
+                      <w:bCs w:val="false"/>
+                      <w:color w:val="1B1917"/>
+                      <w:sz w:val="15"/>
+                      <w:szCs w:val="15"/>
+                    </w:rPr>
+                    <w:t xml:space="preserve">Alfombras / pisos</w:t>
+                  </w:r>
+                </w:p>
+              </w:tc>
+              <w:tc>
+                <w:tcPr>
+                  <w:tcW w:type="dxa" w:w="420"/>
+                  <w:tcBorders>
+                    <w:top w:val="none" w:color="FFFFFF" w:sz="0"/>
+                    <w:left w:val="none" w:color="FFFFFF" w:sz="0"/>
+                    <w:bottom w:val="dotted" w:color="D9D3CD" w:sz="4"/>
+                    <w:right w:val="none" w:color="FFFFFF" w:sz="0"/>
+                  </w:tcBorders>
+                  <w:tcMar>
+                    <w:top w:type="dxa" w:w="0"/>
+                    <w:left w:type="dxa" w:w="0"/>
+                    <w:bottom w:type="dxa" w:w="0"/>
+                    <w:right w:type="dxa" w:w="0"/>
+                  </w:tcMar>
+                  <w:vAlign w:val="center"/>
+                </w:tcPr>
+                <w:p>
+                  <w:pPr>
+                    <w:spacing w:after="0" w:before="0"/>
+                    <w:jc w:val="center"/>
+                  </w:pPr>
+                  <w:r>
+                    <w:rPr>
+                      <w:rFonts w:ascii="Calibri" w:cs="Calibri" w:eastAsia="Calibri" w:hAnsi="Calibri"/>
+                      <w:b w:val="false"/>
+                      <w:bCs w:val="false"/>
+                      <w:color w:val="1B1917"/>
+                      <w:sz w:val="20"/>
+                      <w:szCs w:val="20"/>
+                    </w:rPr>
+                    <w:t xml:space="preserve">☐</w:t>
+                  </w:r>
+                </w:p>
+              </w:tc>
+              <w:tc>
+                <w:tcPr>
+                  <w:tcW w:type="dxa" w:w="420"/>
+                  <w:tcBorders>
+                    <w:top w:val="none" w:color="FFFFFF" w:sz="0"/>
+                    <w:left w:val="none" w:color="FFFFFF" w:sz="0"/>
+                    <w:bottom w:val="dotted" w:color="D9D3CD" w:sz="4"/>
+                    <w:right w:val="none" w:color="FFFFFF" w:sz="0"/>
+                  </w:tcBorders>
+                  <w:tcMar>
+                    <w:top w:type="dxa" w:w="0"/>
+                    <w:left w:type="dxa" w:w="0"/>
+                    <w:bottom w:type="dxa" w:w="0"/>
+                    <w:right w:type="dxa" w:w="0"/>
+                  </w:tcMar>
+                  <w:vAlign w:val="center"/>
+                </w:tcPr>
+                <w:p>
+                  <w:pPr>
+                    <w:spacing w:after="0" w:before="0"/>
+                    <w:jc w:val="center"/>
+                  </w:pPr>
+                  <w:r>
+                    <w:rPr>
+                      <w:rFonts w:ascii="Calibri" w:cs="Calibri" w:eastAsia="Calibri" w:hAnsi="Calibri"/>
+                      <w:b w:val="false"/>
+                      <w:bCs w:val="false"/>
+                      <w:color w:val="1B1917"/>
+                      <w:sz w:val="20"/>
+                      <w:szCs w:val="20"/>
+                    </w:rPr>
+                    <w:t xml:space="preserve">☐</w:t>
+                  </w:r>
+                </w:p>
+              </w:tc>
+              <w:tc>
+                <w:tcPr>
+                  <w:tcW w:type="dxa" w:w="300"/>
+                  <w:tcBorders>
+                    <w:top w:val="none" w:color="FFFFFF" w:sz="0"/>
+                    <w:left w:val="none" w:color="FFFFFF" w:sz="0"/>
+                    <w:bottom w:val="none" w:color="FFFFFF" w:sz="0"/>
+                    <w:right w:val="none" w:color="FFFFFF" w:sz="0"/>
+                  </w:tcBorders>
+                  <w:tcMar>
+                    <w:top w:type="dxa" w:w="0"/>
+                    <w:left w:type="dxa" w:w="0"/>
+                    <w:bottom w:type="dxa" w:w="0"/>
+                    <w:right w:type="dxa" w:w="0"/>
+                  </w:tcMar>
+                  <w:vAlign w:val="center"/>
+                </w:tcPr>
+                <w:p>
+                  <w:pPr>
+                    <w:spacing w:after="0" w:before="0"/>
+                  </w:pPr>
+                  <w:r>
+                    <w:rPr>
+                      <w:rFonts w:ascii="Calibri" w:cs="Calibri" w:eastAsia="Calibri" w:hAnsi="Calibri"/>
+                      <w:b w:val="false"/>
+                      <w:bCs w:val="false"/>
+                      <w:color w:val="1B1917"/>
+                      <w:sz w:val="24"/>
+                      <w:szCs w:val="24"/>
+                    </w:rPr>
+                    <w:t xml:space="preserve"/>
+                  </w:r>
+                </w:p>
+              </w:tc>
+              <w:tc>
+                <w:tcPr>
+                  <w:tcW w:type="dxa" w:w="2445"/>
+                  <w:tcBorders>
+                    <w:top w:val="none" w:color="FFFFFF" w:sz="0"/>
+                    <w:left w:val="none" w:color="FFFFFF" w:sz="0"/>
+                    <w:bottom w:val="dotted" w:color="D9D3CD" w:sz="4"/>
+                    <w:right w:val="none" w:color="FFFFFF" w:sz="0"/>
+                  </w:tcBorders>
+                  <w:tcMar>
+                    <w:top w:type="dxa" w:w="0"/>
+                    <w:left w:type="dxa" w:w="0"/>
+                    <w:bottom w:type="dxa" w:w="0"/>
+                    <w:right w:type="dxa" w:w="0"/>
+                  </w:tcMar>
+                  <w:vAlign w:val="center"/>
+                </w:tcPr>
+                <w:p>
+                  <w:pPr>
+                    <w:spacing w:after="0" w:before="0"/>
+                  </w:pPr>
+                  <w:r>
+                    <w:rPr>
+                      <w:rFonts w:ascii="Calibri" w:cs="Calibri" w:eastAsia="Calibri" w:hAnsi="Calibri"/>
+                      <w:b w:val="false"/>
+                      <w:bCs w:val="false"/>
+                      <w:color w:val="1B1917"/>
+                      <w:sz w:val="15"/>
+                      <w:szCs w:val="15"/>
+                    </w:rPr>
+                    <w:t xml:space="preserve">Cinturones de seg.</w:t>
+                  </w:r>
+                </w:p>
+              </w:tc>
+              <w:tc>
+                <w:tcPr>
+                  <w:tcW w:type="dxa" w:w="420"/>
+                  <w:tcBorders>
+                    <w:top w:val="none" w:color="FFFFFF" w:sz="0"/>
+                    <w:left w:val="none" w:color="FFFFFF" w:sz="0"/>
+                    <w:bottom w:val="dotted" w:color="D9D3CD" w:sz="4"/>
+                    <w:right w:val="none" w:color="FFFFFF" w:sz="0"/>
+                  </w:tcBorders>
+                  <w:tcMar>
+                    <w:top w:type="dxa" w:w="0"/>
+                    <w:left w:type="dxa" w:w="0"/>
+                    <w:bottom w:type="dxa" w:w="0"/>
+                    <w:right w:type="dxa" w:w="0"/>
+                  </w:tcMar>
+                  <w:vAlign w:val="center"/>
+                </w:tcPr>
+                <w:p>
+                  <w:pPr>
+                    <w:spacing w:after="0" w:before="0"/>
+                    <w:jc w:val="center"/>
+                  </w:pPr>
+                  <w:r>
+                    <w:rPr>
+                      <w:rFonts w:ascii="Calibri" w:cs="Calibri" w:eastAsia="Calibri" w:hAnsi="Calibri"/>
+                      <w:b w:val="false"/>
+                      <w:bCs w:val="false"/>
+                      <w:color w:val="1B1917"/>
+                      <w:sz w:val="20"/>
+                      <w:szCs w:val="20"/>
+                    </w:rPr>
+                    <w:t xml:space="preserve">☐</w:t>
+                  </w:r>
+                </w:p>
+              </w:tc>
+              <w:tc>
+                <w:tcPr>
+                  <w:tcW w:type="dxa" w:w="420"/>
+                  <w:tcBorders>
+                    <w:top w:val="none" w:color="FFFFFF" w:sz="0"/>
+                    <w:left w:val="none" w:color="FFFFFF" w:sz="0"/>
+                    <w:bottom w:val="dotted" w:color="D9D3CD" w:sz="4"/>
+                    <w:right w:val="none" w:color="FFFFFF" w:sz="0"/>
+                  </w:tcBorders>
+                  <w:tcMar>
+                    <w:top w:type="dxa" w:w="0"/>
+                    <w:left w:type="dxa" w:w="0"/>
+                    <w:bottom w:type="dxa" w:w="0"/>
+                    <w:right w:type="dxa" w:w="0"/>
+                  </w:tcMar>
+                  <w:vAlign w:val="center"/>
+                </w:tcPr>
+                <w:p>
+                  <w:pPr>
+                    <w:spacing w:after="0" w:before="0"/>
+                    <w:jc w:val="center"/>
+                  </w:pPr>
+                  <w:r>
+                    <w:rPr>
+                      <w:rFonts w:ascii="Calibri" w:cs="Calibri" w:eastAsia="Calibri" w:hAnsi="Calibri"/>
+                      <w:b w:val="false"/>
+                      <w:bCs w:val="false"/>
+                      <w:color w:val="1B1917"/>
+                      <w:sz w:val="20"/>
+                      <w:szCs w:val="20"/>
+                    </w:rPr>
+                    <w:t xml:space="preserve">☐</w:t>
+                  </w:r>
+                </w:p>
+              </w:tc>
+            </w:tr>
+          </w:tbl>
+          <w:p/>
+        </w:tc>
+      </w:tr>
+    </w:tbl>
+    <w:p>
+      <w:pPr>
+        <w:spacing w:after="80" w:before="0"/>
       </w:pPr>
       <w:r>
         <w:rPr>
@@ -6755,7 +8743,7 @@
     </w:tbl>
     <w:p>
       <w:pPr>
-        <w:spacing w:after="60" w:before="0"/>
+        <w:spacing w:after="50" w:before="0"/>
       </w:pPr>
       <w:r>
         <w:rPr>
@@ -6819,7 +8807,7 @@
             </w:tblGrid>
             <w:tr>
               <w:trPr>
-                <w:trHeight w:val="280" w:hRule="exact"/>
+                <w:trHeight w:val="250" w:hRule="exact"/>
               </w:trPr>
               <w:tc>
                 <w:tcPr>
@@ -6858,7 +8846,7 @@
             </w:tr>
             <w:tr>
               <w:trPr>
-                <w:trHeight w:val="280" w:hRule="exact"/>
+                <w:trHeight w:val="250" w:hRule="exact"/>
               </w:trPr>
               <w:tc>
                 <w:tcPr>
@@ -6897,46 +8885,7 @@
             </w:tr>
             <w:tr>
               <w:trPr>
-                <w:trHeight w:val="280" w:hRule="exact"/>
-              </w:trPr>
-              <w:tc>
-                <w:tcPr>
-                  <w:tcW w:type="dxa" w:w="10154"/>
-                  <w:tcBorders>
-                    <w:top w:val="none" w:color="FFFFFF" w:sz="0"/>
-                    <w:left w:val="none" w:color="FFFFFF" w:sz="0"/>
-                    <w:bottom w:val="single" w:color="D9D3CD" w:sz="4"/>
-                    <w:right w:val="none" w:color="FFFFFF" w:sz="0"/>
-                  </w:tcBorders>
-                  <w:tcMar>
-                    <w:top w:type="dxa" w:w="0"/>
-                    <w:left w:type="dxa" w:w="30"/>
-                    <w:bottom w:type="dxa" w:w="0"/>
-                    <w:right w:type="dxa" w:w="30"/>
-                  </w:tcMar>
-                  <w:vAlign w:val="center"/>
-                </w:tcPr>
-                <w:p>
-                  <w:pPr>
-                    <w:spacing w:after="0" w:before="0"/>
-                  </w:pPr>
-                  <w:r>
-                    <w:rPr>
-                      <w:rFonts w:ascii="Calibri" w:cs="Calibri" w:eastAsia="Calibri" w:hAnsi="Calibri"/>
-                      <w:b w:val="false"/>
-                      <w:bCs w:val="false"/>
-                      <w:color w:val="1B1917"/>
-                      <w:sz w:val="22"/>
-                      <w:szCs w:val="22"/>
-                    </w:rPr>
-                    <w:t xml:space="preserve"/>
-                  </w:r>
-                </w:p>
-              </w:tc>
-            </w:tr>
-            <w:tr>
-              <w:trPr>
-                <w:trHeight w:val="280" w:hRule="exact"/>
+                <w:trHeight w:val="250" w:hRule="exact"/>
               </w:trPr>
               <w:tc>
                 <w:tcPr>
@@ -6980,7 +8929,7 @@
     </w:tbl>
     <w:p>
       <w:pPr>
-        <w:spacing w:after="0" w:before="120"/>
+        <w:spacing w:after="0" w:before="30"/>
       </w:pPr>
       <w:r>
         <w:rPr>
@@ -6988,15 +8937,15 @@
           <w:b w:val="false"/>
           <w:bCs w:val="false"/>
           <w:color w:val="6E6660"/>
-          <w:sz w:val="14"/>
-          <w:szCs w:val="14"/>
+          <w:sz w:val="13"/>
+          <w:szCs w:val="13"/>
         </w:rPr>
         <w:t xml:space="preserve">El cliente declara que los datos y el estado de las partes consignados en esta hoja corresponden al vehículo al momento de su ingreso. ABARCA no se responsabiliza por dinero, documentos u objetos de valor dejados en el interior del vehículo.</w:t>
       </w:r>
     </w:p>
     <w:p>
       <w:pPr>
-        <w:spacing w:after="200" w:before="0"/>
+        <w:spacing w:after="20" w:before="0"/>
       </w:pPr>
       <w:r>
         <w:rPr>

</xml_diff>